<commit_message>
Add Caraga ops: EC inventory, preparedness, and LGU workflows.
Ship the current DROMIS working tree with evacuation-center dashboards, preparedness-for-response, DSWD DROMIC consolidation, dispatch monitoring, and LGU credential/personnel support.

Co-authored-by: Cursor <cursoragent@cursor.com>
</commit_message>
<xml_diff>
--- a/storage/app/templates/Response Letter.docx
+++ b/storage/app/templates/Response Letter.docx
@@ -1,6 +1,6 @@
 
 <file path=word/document.xml><?xml version="1.0" encoding="utf-8"?>
-<w:document xmlns:wpc="http://schemas.microsoft.com/office/word/2010/wordprocessingCanvas" xmlns:cx="http://schemas.microsoft.com/office/drawing/2014/chartex" xmlns:cx1="http://schemas.microsoft.com/office/drawing/2015/9/8/chartex" xmlns:cx2="http://schemas.microsoft.com/office/drawing/2015/10/21/chartex" xmlns:cx3="http://schemas.microsoft.com/office/drawing/2016/5/9/chartex" xmlns:cx4="http://schemas.microsoft.com/office/drawing/2016/5/10/chartex" xmlns:cx5="http://schemas.microsoft.com/office/drawing/2016/5/11/chartex" xmlns:cx6="http://schemas.microsoft.com/office/drawing/2016/5/12/chartex" xmlns:cx7="http://schemas.microsoft.com/office/drawing/2016/5/13/chartex" xmlns:cx8="http://schemas.microsoft.com/office/drawing/2016/5/14/chartex" xmlns:mc="http://schemas.openxmlformats.org/markup-compatibility/2006" xmlns:aink="http://schemas.microsoft.com/office/drawing/2016/ink" xmlns:am3d="http://schemas.microsoft.com/office/drawing/2017/model3d" xmlns:o="urn:schemas-microsoft-com:office:office" xmlns:oel="http://schemas.microsoft.com/office/2019/extlst" xmlns:r="http://schemas.openxmlformats.org/officeDocument/2006/relationships" xmlns:m="http://schemas.openxmlformats.org/officeDocument/2006/math" xmlns:v="urn:schemas-microsoft-com:vml" xmlns:wp14="http://schemas.microsoft.com/office/word/2010/wordprocessingDrawing" xmlns:wp="http://schemas.openxmlformats.org/drawingml/2006/wordprocessingDrawing" xmlns:w10="urn:schemas-microsoft-com:office:word" xmlns:w="http://schemas.openxmlformats.org/wordprocessingml/2006/main" xmlns:w14="http://schemas.microsoft.com/office/word/2010/wordml" xmlns:w15="http://schemas.microsoft.com/office/word/2012/wordml" xmlns:w16cex="http://schemas.microsoft.com/office/word/2018/wordml/cex" xmlns:w16cid="http://schemas.microsoft.com/office/word/2016/wordml/cid" xmlns:w16="http://schemas.microsoft.com/office/word/2018/wordml" xmlns:w16du="http://schemas.microsoft.com/office/word/2023/wordml/word16du" xmlns:w16sdtdh="http://schemas.microsoft.com/office/word/2020/wordml/sdtdatahash" xmlns:w16sdtfl="http://schemas.microsoft.com/office/word/2024/wordml/sdtformatlock" xmlns:w16se="http://schemas.microsoft.com/office/word/2015/wordml/symex" xmlns:wpg="http://schemas.microsoft.com/office/word/2010/wordprocessingGroup" xmlns:wpi="http://schemas.microsoft.com/office/word/2010/wordprocessingInk" xmlns:wne="http://schemas.microsoft.com/office/word/2006/wordml" xmlns:wps="http://schemas.microsoft.com/office/word/2010/wordprocessingShape" mc:Ignorable="w14 w15 w16se w16cid w16 w16cex w16sdtdh w16sdtfl w16du wp14">
+<w:document xmlns:wpc="http://schemas.microsoft.com/office/word/2010/wordprocessingCanvas" xmlns:mc="http://schemas.openxmlformats.org/markup-compatibility/2006" xmlns:o="urn:schemas-microsoft-com:office:office" xmlns:r="http://schemas.openxmlformats.org/officeDocument/2006/relationships" xmlns:m="http://schemas.openxmlformats.org/officeDocument/2006/math" xmlns:v="urn:schemas-microsoft-com:vml" xmlns:wp14="http://schemas.microsoft.com/office/word/2010/wordprocessingDrawing" xmlns:wp="http://schemas.openxmlformats.org/drawingml/2006/wordprocessingDrawing" xmlns:w10="urn:schemas-microsoft-com:office:word" xmlns:w="http://schemas.openxmlformats.org/wordprocessingml/2006/main" xmlns:w14="http://schemas.microsoft.com/office/word/2010/wordml" xmlns:w15="http://schemas.microsoft.com/office/word/2012/wordml" xmlns:wpg="http://schemas.microsoft.com/office/word/2010/wordprocessingGroup" xmlns:wpi="http://schemas.microsoft.com/office/word/2010/wordprocessingInk" xmlns:wne="http://schemas.microsoft.com/office/word/2006/wordml" xmlns:wps="http://schemas.microsoft.com/office/word/2010/wordprocessingShape" mc:Ignorable="w14 w15 wp14">
   <w:body>
     <w:p>
       <w:pPr>
@@ -309,6 +309,7 @@
         <w:rPr>
           <w:rFonts w:ascii="Arial" w:eastAsia="Arial" w:hAnsi="Arial" w:cs="Arial"/>
           <w:noProof/>
+          <w:lang w:val="en-US" w:eastAsia="en-US"/>
         </w:rPr>
         <w:drawing>
           <wp:anchor distT="0" distB="0" distL="114300" distR="114300" simplePos="0" relativeHeight="251660288" behindDoc="0" locked="0" layoutInCell="1" allowOverlap="1">
@@ -534,7 +535,13 @@
         <w:rPr>
           <w:rFonts w:ascii="Arial" w:eastAsia="Arial" w:hAnsi="Arial" w:cs="Arial"/>
         </w:rPr>
-        <w:t>With this, the Regional Resource Operations Section (RROS) personnel will prepare the Requisition and Issuance Slip (RIS) of the said items. The assigned social worker will immediately coordinate with the Focal Person once the documents are prepared and the goods are ready for delivery and/or pick</w:t>
+        <w:t xml:space="preserve">With this, the Regional Resource Operations Section (RROS) personnel will prepare the Requisition and Issuance Slip (RIS) of the said items. The assigned social worker will immediately coordinate with the Focal Person </w:t>
+      </w:r>
+      <w:r>
+        <w:rPr>
+          <w:rFonts w:ascii="Arial" w:eastAsia="Arial" w:hAnsi="Arial" w:cs="Arial"/>
+        </w:rPr>
+        <w:t>once the documents are prepared and the goods are ready for delivery and/or pick</w:t>
       </w:r>
       <w:r>
         <w:rPr>
@@ -586,7 +593,13 @@
         <w:rPr>
           <w:rFonts w:ascii="Arial" w:eastAsia="Arial" w:hAnsi="Arial" w:cs="Arial"/>
         </w:rPr>
-        <w:t>Thank you.</w:t>
+        <w:t>Tha</w:t>
+      </w:r>
+      <w:r>
+        <w:rPr>
+          <w:rFonts w:ascii="Arial" w:eastAsia="Arial" w:hAnsi="Arial" w:cs="Arial"/>
+        </w:rPr>
+        <w:t>nk you.</w:t>
       </w:r>
     </w:p>
     <w:p>
@@ -653,10 +666,12 @@
           <w:rFonts w:ascii="Arial" w:eastAsia="Arial" w:hAnsi="Arial" w:cs="Arial"/>
           <w:i/>
           <w:iCs/>
-          <w:sz w:val="18"/>
-          <w:szCs w:val="18"/>
+          <w:sz w:val="16"/>
+          <w:szCs w:val="16"/>
         </w:rPr>
       </w:pPr>
+      <w:bookmarkStart w:id="0" w:name="_GoBack"/>
+      <w:bookmarkEnd w:id="0"/>
       <w:r>
         <w:rPr>
           <w:rFonts w:ascii="Arial" w:eastAsia="Arial" w:hAnsi="Arial" w:cs="Arial"/>
@@ -713,6 +728,496 @@
         </w:rPr>
         <w:t>8</w:t>
       </w:r>
+    </w:p>
+    <w:p>
+      <w:pPr>
+        <w:spacing w:after="0"/>
+        <w:rPr>
+          <w:rFonts w:ascii="Arial" w:eastAsia="Arial" w:hAnsi="Arial" w:cs="Arial"/>
+          <w:i/>
+          <w:iCs/>
+          <w:sz w:val="16"/>
+          <w:szCs w:val="16"/>
+        </w:rPr>
+      </w:pPr>
+    </w:p>
+    <w:p>
+      <w:pPr>
+        <w:tabs>
+          <w:tab w:val="left" w:pos="7747"/>
+        </w:tabs>
+        <w:ind w:firstLine="0"/>
+        <w:rPr>
+          <w:rFonts w:ascii="Arial" w:eastAsia="Arial" w:hAnsi="Arial" w:cs="Arial"/>
+          <w:sz w:val="14"/>
+          <w:szCs w:val="14"/>
+          <w:lang w:val="en-US"/>
+        </w:rPr>
+      </w:pPr>
+    </w:p>
+    <w:p>
+      <w:pPr>
+        <w:rPr>
+          <w:rFonts w:ascii="Arial" w:eastAsia="Arial" w:hAnsi="Arial" w:cs="Arial"/>
+          <w:sz w:val="24"/>
+          <w:szCs w:val="24"/>
+        </w:rPr>
+      </w:pPr>
+      <w:r>
+        <w:rPr>
+          <w:rFonts w:ascii="Arial" w:eastAsia="Arial" w:hAnsi="Arial" w:cs="Arial"/>
+          <w:sz w:val="24"/>
+          <w:szCs w:val="24"/>
+        </w:rPr>
+        <w:t>NOVEMBER 5, 2025</w:t>
+      </w:r>
+      <w:r>
+        <w:rPr>
+          <w:rFonts w:ascii="Arial" w:eastAsia="Arial" w:hAnsi="Arial" w:cs="Arial"/>
+          <w:sz w:val="24"/>
+          <w:szCs w:val="24"/>
+        </w:rPr>
+        <w:br/>
+      </w:r>
+    </w:p>
+    <w:p>
+      <w:pPr>
+        <w:rPr>
+          <w:rFonts w:ascii="Arial" w:eastAsia="Arial" w:hAnsi="Arial" w:cs="Arial"/>
+        </w:rPr>
+      </w:pPr>
+      <w:r>
+        <w:rPr>
+          <w:rFonts w:ascii="Arial" w:eastAsia="Arial" w:hAnsi="Arial" w:cs="Arial"/>
+          <w:b/>
+        </w:rPr>
+        <w:t>HON. PABLO YVES L. DUMLAO II</w:t>
+      </w:r>
+      <w:r>
+        <w:rPr>
+          <w:rFonts w:ascii="Arial" w:eastAsia="Arial" w:hAnsi="Arial" w:cs="Arial"/>
+          <w:sz w:val="24"/>
+          <w:szCs w:val="24"/>
+        </w:rPr>
+        <w:br/>
+      </w:r>
+      <w:r>
+        <w:rPr>
+          <w:rFonts w:ascii="Arial" w:eastAsia="Arial" w:hAnsi="Arial" w:cs="Arial"/>
+        </w:rPr>
+        <w:t>City Mayor</w:t>
+      </w:r>
+      <w:r>
+        <w:rPr>
+          <w:rFonts w:ascii="Arial" w:eastAsia="Arial" w:hAnsi="Arial" w:cs="Arial"/>
+        </w:rPr>
+        <w:br/>
+      </w:r>
+      <w:proofErr w:type="spellStart"/>
+      <w:r>
+        <w:rPr>
+          <w:rFonts w:ascii="Arial" w:eastAsia="Arial" w:hAnsi="Arial" w:cs="Arial"/>
+        </w:rPr>
+        <w:t>Surigao</w:t>
+      </w:r>
+      <w:proofErr w:type="spellEnd"/>
+      <w:r>
+        <w:rPr>
+          <w:rFonts w:ascii="Arial" w:eastAsia="Arial" w:hAnsi="Arial" w:cs="Arial"/>
+        </w:rPr>
+        <w:t xml:space="preserve"> City, </w:t>
+      </w:r>
+      <w:proofErr w:type="spellStart"/>
+      <w:r>
+        <w:rPr>
+          <w:rFonts w:ascii="Arial" w:eastAsia="Arial" w:hAnsi="Arial" w:cs="Arial"/>
+        </w:rPr>
+        <w:t>Surigao</w:t>
+      </w:r>
+      <w:proofErr w:type="spellEnd"/>
+      <w:r>
+        <w:rPr>
+          <w:rFonts w:ascii="Arial" w:eastAsia="Arial" w:hAnsi="Arial" w:cs="Arial"/>
+        </w:rPr>
+        <w:t xml:space="preserve"> Del Norte</w:t>
+      </w:r>
+    </w:p>
+    <w:p>
+      <w:pPr>
+        <w:rPr>
+          <w:rFonts w:ascii="Arial" w:eastAsia="Arial" w:hAnsi="Arial" w:cs="Arial"/>
+        </w:rPr>
+      </w:pPr>
+      <w:r>
+        <w:rPr>
+          <w:rFonts w:ascii="Arial" w:eastAsia="Arial" w:hAnsi="Arial" w:cs="Arial"/>
+        </w:rPr>
+        <w:t xml:space="preserve">                  </w:t>
+      </w:r>
+    </w:p>
+    <w:p>
+      <w:pPr>
+        <w:spacing w:after="0"/>
+        <w:rPr>
+          <w:rFonts w:ascii="Arial" w:eastAsia="Arial" w:hAnsi="Arial" w:cs="Arial"/>
+        </w:rPr>
+      </w:pPr>
+      <w:r>
+        <w:rPr>
+          <w:rFonts w:ascii="Arial" w:eastAsia="Arial" w:hAnsi="Arial" w:cs="Arial"/>
+        </w:rPr>
+        <w:t xml:space="preserve">ATTENTION:    </w:t>
+      </w:r>
+      <w:r>
+        <w:rPr>
+          <w:rFonts w:ascii="Arial" w:eastAsia="Arial" w:hAnsi="Arial" w:cs="Arial"/>
+          <w:b/>
+          <w:bCs/>
+        </w:rPr>
+        <w:t>MS. LENIE SUAZO LIRAY, RSW, JD</w:t>
+      </w:r>
+    </w:p>
+    <w:p>
+      <w:pPr>
+        <w:spacing w:after="0"/>
+        <w:rPr>
+          <w:rFonts w:ascii="Arial" w:eastAsia="Arial" w:hAnsi="Arial" w:cs="Arial"/>
+        </w:rPr>
+      </w:pPr>
+      <w:r>
+        <w:rPr>
+          <w:rFonts w:ascii="Arial" w:eastAsia="Arial" w:hAnsi="Arial" w:cs="Arial"/>
+        </w:rPr>
+        <w:t xml:space="preserve">                         CSWDO</w:t>
+      </w:r>
+    </w:p>
+    <w:p>
+      <w:pPr>
+        <w:rPr>
+          <w:rFonts w:ascii="Arial" w:eastAsia="Arial" w:hAnsi="Arial" w:cs="Arial"/>
+        </w:rPr>
+      </w:pPr>
+    </w:p>
+    <w:p>
+      <w:pPr>
+        <w:rPr>
+          <w:rFonts w:ascii="Arial" w:eastAsia="Arial" w:hAnsi="Arial" w:cs="Arial"/>
+          <w:i/>
+          <w:iCs/>
+        </w:rPr>
+      </w:pPr>
+      <w:r>
+        <w:rPr>
+          <w:rFonts w:ascii="Arial" w:eastAsia="Arial" w:hAnsi="Arial" w:cs="Arial"/>
+        </w:rPr>
+        <w:t xml:space="preserve">Dear </w:t>
+      </w:r>
+      <w:r>
+        <w:rPr>
+          <w:rFonts w:ascii="Arial" w:eastAsia="Arial" w:hAnsi="Arial" w:cs="Arial"/>
+          <w:b/>
+          <w:i/>
+          <w:iCs/>
+        </w:rPr>
+        <w:t>Mayor Dumlao</w:t>
+      </w:r>
+      <w:proofErr w:type="gramStart"/>
+      <w:r>
+        <w:rPr>
+          <w:rFonts w:ascii="Arial" w:eastAsia="Arial" w:hAnsi="Arial" w:cs="Arial"/>
+          <w:i/>
+          <w:iCs/>
+        </w:rPr>
+        <w:t>:</w:t>
+      </w:r>
+      <w:proofErr w:type="gramEnd"/>
+      <w:r>
+        <w:rPr>
+          <w:rFonts w:ascii="Arial" w:eastAsia="Arial" w:hAnsi="Arial" w:cs="Arial"/>
+          <w:i/>
+          <w:iCs/>
+        </w:rPr>
+        <w:br/>
+      </w:r>
+      <w:r>
+        <w:rPr>
+          <w:rFonts w:ascii="Arial" w:eastAsia="Arial" w:hAnsi="Arial" w:cs="Arial"/>
+          <w:i/>
+          <w:iCs/>
+        </w:rPr>
+        <w:br/>
+      </w:r>
+      <w:r>
+        <w:rPr>
+          <w:rFonts w:ascii="Arial" w:eastAsia="Arial" w:hAnsi="Arial" w:cs="Arial"/>
+          <w:i/>
+          <w:iCs/>
+        </w:rPr>
+        <w:br/>
+      </w:r>
+      <w:r>
+        <w:rPr>
+          <w:rFonts w:ascii="Arial" w:eastAsia="Arial" w:hAnsi="Arial" w:cs="Arial"/>
+          <w:i/>
+          <w:iCs/>
+        </w:rPr>
+        <w:t>Greetings of service excellence and resilience!</w:t>
+      </w:r>
+    </w:p>
+    <w:p>
+      <w:pPr>
+        <w:jc w:val="both"/>
+        <w:rPr>
+          <w:rFonts w:ascii="Arial" w:eastAsia="Arial" w:hAnsi="Arial" w:cs="Arial"/>
+        </w:rPr>
+      </w:pPr>
+      <w:r>
+        <w:rPr>
+          <w:rFonts w:ascii="Arial" w:eastAsia="Arial" w:hAnsi="Arial" w:cs="Arial"/>
+          <w:noProof/>
+          <w:lang w:val="en-US" w:eastAsia="en-US"/>
+        </w:rPr>
+        <w:drawing>
+          <wp:anchor distT="0" distB="0" distL="114300" distR="114300" simplePos="0" relativeHeight="251662336" behindDoc="0" locked="0" layoutInCell="1" allowOverlap="1" wp14:anchorId="75172C5F" wp14:editId="150E2011">
+            <wp:simplePos x="0" y="0"/>
+            <wp:positionH relativeFrom="column">
+              <wp:posOffset>5829935</wp:posOffset>
+            </wp:positionH>
+            <wp:positionV relativeFrom="paragraph">
+              <wp:posOffset>5721350</wp:posOffset>
+            </wp:positionV>
+            <wp:extent cx="635" cy="635"/>
+            <wp:effectExtent l="0" t="0" r="0" b="0"/>
+            <wp:wrapNone/>
+            <wp:docPr id="9" name="Picture 9"/>
+            <wp:cNvGraphicFramePr>
+              <a:graphicFrameLocks xmlns:a="http://schemas.openxmlformats.org/drawingml/2006/main" noChangeAspect="1"/>
+            </wp:cNvGraphicFramePr>
+            <a:graphic xmlns:a="http://schemas.openxmlformats.org/drawingml/2006/main">
+              <a:graphicData uri="http://schemas.openxmlformats.org/drawingml/2006/picture">
+                <pic:pic xmlns:pic="http://schemas.openxmlformats.org/drawingml/2006/picture">
+                  <pic:nvPicPr>
+                    <pic:cNvPr id="141089242" name="Picture 141089242"/>
+                    <pic:cNvPicPr>
+                      <a:picLocks noChangeAspect="1" noChangeArrowheads="1"/>
+                    </pic:cNvPicPr>
+                  </pic:nvPicPr>
+                  <pic:blipFill>
+                    <a:blip r:embed="rId9">
+                      <a:extLst>
+                        <a:ext uri="{28A0092B-C50C-407E-A947-70E740481C1C}">
+                          <a14:useLocalDpi xmlns:a14="http://schemas.microsoft.com/office/drawing/2010/main" val="0"/>
+                        </a:ext>
+                      </a:extLst>
+                    </a:blip>
+                    <a:srcRect/>
+                    <a:stretch>
+                      <a:fillRect/>
+                    </a:stretch>
+                  </pic:blipFill>
+                  <pic:spPr>
+                    <a:xfrm>
+                      <a:off x="0" y="0"/>
+                      <a:ext cx="635" cy="635"/>
+                    </a:xfrm>
+                    <a:prstGeom prst="rect">
+                      <a:avLst/>
+                    </a:prstGeom>
+                    <a:noFill/>
+                  </pic:spPr>
+                </pic:pic>
+              </a:graphicData>
+            </a:graphic>
+          </wp:anchor>
+        </w:drawing>
+      </w:r>
+      <w:r>
+        <w:rPr>
+          <w:rFonts w:ascii="Arial" w:eastAsia="Arial" w:hAnsi="Arial" w:cs="Arial"/>
+        </w:rPr>
+        <w:t xml:space="preserve">This is in reference to your letter requesting for Family Food Packs intended for the 3,264 disaster affected families in your municipality due to TYPHOON “TINO” which was occurred in </w:t>
+      </w:r>
+      <w:proofErr w:type="spellStart"/>
+      <w:r>
+        <w:rPr>
+          <w:rFonts w:ascii="Arial" w:eastAsia="Arial" w:hAnsi="Arial" w:cs="Arial"/>
+        </w:rPr>
+        <w:t>Caraga</w:t>
+      </w:r>
+      <w:proofErr w:type="spellEnd"/>
+      <w:r>
+        <w:rPr>
+          <w:rFonts w:ascii="Arial" w:eastAsia="Arial" w:hAnsi="Arial" w:cs="Arial"/>
+        </w:rPr>
+        <w:t xml:space="preserve"> Region on November 3, 2025.</w:t>
+      </w:r>
+    </w:p>
+    <w:p>
+      <w:pPr>
+        <w:jc w:val="both"/>
+        <w:rPr>
+          <w:rFonts w:ascii="Arial" w:eastAsia="Arial" w:hAnsi="Arial" w:cs="Arial"/>
+        </w:rPr>
+      </w:pPr>
+      <w:r>
+        <w:rPr>
+          <w:rFonts w:ascii="Arial" w:eastAsia="Arial" w:hAnsi="Arial" w:cs="Arial"/>
+        </w:rPr>
+        <w:t xml:space="preserve">After a thorough assessment, conducted by our Social Worker Mr. </w:t>
+      </w:r>
+      <w:proofErr w:type="spellStart"/>
+      <w:r>
+        <w:rPr>
+          <w:rFonts w:ascii="Arial" w:eastAsia="Arial" w:hAnsi="Arial" w:cs="Arial"/>
+        </w:rPr>
+        <w:t>Jhon</w:t>
+      </w:r>
+      <w:proofErr w:type="spellEnd"/>
+      <w:r>
+        <w:rPr>
+          <w:rFonts w:ascii="Arial" w:eastAsia="Arial" w:hAnsi="Arial" w:cs="Arial"/>
+        </w:rPr>
+        <w:t xml:space="preserve"> Carlo B. </w:t>
+      </w:r>
+      <w:proofErr w:type="spellStart"/>
+      <w:r>
+        <w:rPr>
+          <w:rFonts w:ascii="Arial" w:eastAsia="Arial" w:hAnsi="Arial" w:cs="Arial"/>
+        </w:rPr>
+        <w:t>Roxas</w:t>
+      </w:r>
+      <w:proofErr w:type="spellEnd"/>
+      <w:r>
+        <w:rPr>
+          <w:rFonts w:ascii="Arial" w:eastAsia="Arial" w:hAnsi="Arial" w:cs="Arial"/>
+        </w:rPr>
+        <w:t xml:space="preserve">, your municipality is eligible to be provided with the requested goods as augmentation assistance from our office. Hence, we will extend 3,264 boxes of Family Food Packs in the above-number affected families. </w:t>
+      </w:r>
+    </w:p>
+    <w:p>
+      <w:pPr>
+        <w:jc w:val="both"/>
+        <w:rPr>
+          <w:rFonts w:ascii="Arial" w:eastAsia="Arial" w:hAnsi="Arial" w:cs="Arial"/>
+        </w:rPr>
+      </w:pPr>
+      <w:r>
+        <w:rPr>
+          <w:rFonts w:ascii="Arial" w:eastAsia="Arial" w:hAnsi="Arial" w:cs="Arial"/>
+        </w:rPr>
+        <w:t xml:space="preserve">With this, the Regional Resource Operations Section (RROS) personnel will prepare the Requisition and Issuance Slip (RIS) of the said items. The assigned social worker will immediately coordinate with the Focal Person once the documents are prepared and the goods are ready for delivery and/or pick-up from your Local Government Unit Warehouse. For further queries, Mr. </w:t>
+      </w:r>
+      <w:proofErr w:type="spellStart"/>
+      <w:r>
+        <w:rPr>
+          <w:rFonts w:ascii="Arial" w:eastAsia="Arial" w:hAnsi="Arial" w:cs="Arial"/>
+        </w:rPr>
+        <w:t>Roxas</w:t>
+      </w:r>
+      <w:proofErr w:type="spellEnd"/>
+      <w:r>
+        <w:rPr>
+          <w:rFonts w:ascii="Arial" w:eastAsia="Arial" w:hAnsi="Arial" w:cs="Arial"/>
+        </w:rPr>
+        <w:t>, will be coordinating with you through this mobile number 0963-5915-148.</w:t>
+      </w:r>
+    </w:p>
+    <w:p>
+      <w:pPr>
+        <w:jc w:val="both"/>
+        <w:rPr>
+          <w:rFonts w:ascii="Arial" w:eastAsia="Arial" w:hAnsi="Arial" w:cs="Arial"/>
+        </w:rPr>
+      </w:pPr>
+      <w:r>
+        <w:rPr>
+          <w:rFonts w:ascii="Arial" w:eastAsia="Arial" w:hAnsi="Arial" w:cs="Arial"/>
+        </w:rPr>
+        <w:t>For your information.</w:t>
+      </w:r>
+    </w:p>
+    <w:p>
+      <w:pPr>
+        <w:jc w:val="both"/>
+        <w:rPr>
+          <w:rFonts w:ascii="Arial" w:eastAsia="Arial" w:hAnsi="Arial" w:cs="Arial"/>
+        </w:rPr>
+      </w:pPr>
+      <w:r>
+        <w:rPr>
+          <w:rFonts w:ascii="Arial" w:eastAsia="Arial" w:hAnsi="Arial" w:cs="Arial"/>
+        </w:rPr>
+        <w:t>Thank you.</w:t>
+      </w:r>
+    </w:p>
+    <w:p>
+      <w:pPr>
+        <w:rPr>
+          <w:rFonts w:ascii="Arial" w:eastAsia="Arial" w:hAnsi="Arial" w:cs="Arial"/>
+        </w:rPr>
+      </w:pPr>
+    </w:p>
+    <w:p>
+      <w:pPr>
+        <w:rPr>
+          <w:rFonts w:ascii="Arial" w:eastAsia="Arial" w:hAnsi="Arial" w:cs="Arial"/>
+        </w:rPr>
+      </w:pPr>
+      <w:r>
+        <w:rPr>
+          <w:rFonts w:ascii="Arial" w:eastAsia="Arial" w:hAnsi="Arial" w:cs="Arial"/>
+        </w:rPr>
+        <w:t>Respectfully yours,</w:t>
+      </w:r>
+    </w:p>
+    <w:p>
+      <w:pPr>
+        <w:rPr>
+          <w:rFonts w:ascii="Arial" w:eastAsia="Arial" w:hAnsi="Arial" w:cs="Arial"/>
+        </w:rPr>
+      </w:pPr>
+    </w:p>
+    <w:p>
+      <w:pPr>
+        <w:spacing w:after="0"/>
+        <w:rPr>
+          <w:rFonts w:ascii="Arial" w:eastAsia="Arial" w:hAnsi="Arial" w:cs="Arial"/>
+          <w:b/>
+        </w:rPr>
+      </w:pPr>
+      <w:r>
+        <w:rPr>
+          <w:rFonts w:ascii="Arial" w:eastAsia="Arial" w:hAnsi="Arial" w:cs="Arial"/>
+          <w:b/>
+        </w:rPr>
+        <w:t>MARI- FLOR A. DOLLAGA- LIBANG</w:t>
+      </w:r>
+    </w:p>
+    <w:p>
+      <w:pPr>
+        <w:spacing w:after="0"/>
+        <w:rPr>
+          <w:rFonts w:ascii="Arial" w:eastAsia="Arial" w:hAnsi="Arial" w:cs="Arial"/>
+        </w:rPr>
+      </w:pPr>
+      <w:r>
+        <w:rPr>
+          <w:rFonts w:ascii="Arial" w:eastAsia="Arial" w:hAnsi="Arial" w:cs="Arial"/>
+        </w:rPr>
+        <w:t>Regional Director</w:t>
+      </w:r>
+    </w:p>
+    <w:p>
+      <w:pPr>
+        <w:spacing w:after="0"/>
+        <w:rPr>
+          <w:rFonts w:ascii="Arial" w:eastAsia="Arial" w:hAnsi="Arial" w:cs="Arial"/>
+          <w:i/>
+          <w:iCs/>
+          <w:sz w:val="18"/>
+          <w:szCs w:val="18"/>
+        </w:rPr>
+      </w:pPr>
     </w:p>
     <w:sectPr>
       <w:headerReference w:type="even" r:id="rId10"/>
@@ -733,7 +1238,7 @@
 </file>
 
 <file path=word/endnotes.xml><?xml version="1.0" encoding="utf-8"?>
-<w:endnotes xmlns:wpc="http://schemas.microsoft.com/office/word/2010/wordprocessingCanvas" xmlns:cx="http://schemas.microsoft.com/office/drawing/2014/chartex" xmlns:cx1="http://schemas.microsoft.com/office/drawing/2015/9/8/chartex" xmlns:cx2="http://schemas.microsoft.com/office/drawing/2015/10/21/chartex" xmlns:cx3="http://schemas.microsoft.com/office/drawing/2016/5/9/chartex" xmlns:cx4="http://schemas.microsoft.com/office/drawing/2016/5/10/chartex" xmlns:cx5="http://schemas.microsoft.com/office/drawing/2016/5/11/chartex" xmlns:cx6="http://schemas.microsoft.com/office/drawing/2016/5/12/chartex" xmlns:cx7="http://schemas.microsoft.com/office/drawing/2016/5/13/chartex" xmlns:cx8="http://schemas.microsoft.com/office/drawing/2016/5/14/chartex" xmlns:mc="http://schemas.openxmlformats.org/markup-compatibility/2006" xmlns:aink="http://schemas.microsoft.com/office/drawing/2016/ink" xmlns:am3d="http://schemas.microsoft.com/office/drawing/2017/model3d" xmlns:o="urn:schemas-microsoft-com:office:office" xmlns:oel="http://schemas.microsoft.com/office/2019/extlst" xmlns:r="http://schemas.openxmlformats.org/officeDocument/2006/relationships" xmlns:m="http://schemas.openxmlformats.org/officeDocument/2006/math" xmlns:v="urn:schemas-microsoft-com:vml" xmlns:wp14="http://schemas.microsoft.com/office/word/2010/wordprocessingDrawing" xmlns:wp="http://schemas.openxmlformats.org/drawingml/2006/wordprocessingDrawing" xmlns:w10="urn:schemas-microsoft-com:office:word" xmlns:w="http://schemas.openxmlformats.org/wordprocessingml/2006/main" xmlns:w14="http://schemas.microsoft.com/office/word/2010/wordml" xmlns:w15="http://schemas.microsoft.com/office/word/2012/wordml" xmlns:w16cex="http://schemas.microsoft.com/office/word/2018/wordml/cex" xmlns:w16cid="http://schemas.microsoft.com/office/word/2016/wordml/cid" xmlns:w16="http://schemas.microsoft.com/office/word/2018/wordml" xmlns:w16du="http://schemas.microsoft.com/office/word/2023/wordml/word16du" xmlns:w16sdtdh="http://schemas.microsoft.com/office/word/2020/wordml/sdtdatahash" xmlns:w16sdtfl="http://schemas.microsoft.com/office/word/2024/wordml/sdtformatlock" xmlns:w16se="http://schemas.microsoft.com/office/word/2015/wordml/symex" xmlns:wpg="http://schemas.microsoft.com/office/word/2010/wordprocessingGroup" xmlns:wpi="http://schemas.microsoft.com/office/word/2010/wordprocessingInk" xmlns:wne="http://schemas.microsoft.com/office/word/2006/wordml" xmlns:wps="http://schemas.microsoft.com/office/word/2010/wordprocessingShape" mc:Ignorable="w14 w15 w16se w16cid w16 w16cex w16sdtdh w16sdtfl w16du wp14">
+<w:endnotes xmlns:wpc="http://schemas.microsoft.com/office/word/2010/wordprocessingCanvas" xmlns:mc="http://schemas.openxmlformats.org/markup-compatibility/2006" xmlns:o="urn:schemas-microsoft-com:office:office" xmlns:r="http://schemas.openxmlformats.org/officeDocument/2006/relationships" xmlns:m="http://schemas.openxmlformats.org/officeDocument/2006/math" xmlns:v="urn:schemas-microsoft-com:vml" xmlns:wp14="http://schemas.microsoft.com/office/word/2010/wordprocessingDrawing" xmlns:wp="http://schemas.openxmlformats.org/drawingml/2006/wordprocessingDrawing" xmlns:w10="urn:schemas-microsoft-com:office:word" xmlns:w="http://schemas.openxmlformats.org/wordprocessingml/2006/main" xmlns:w14="http://schemas.microsoft.com/office/word/2010/wordml" xmlns:w15="http://schemas.microsoft.com/office/word/2012/wordml" xmlns:wpg="http://schemas.microsoft.com/office/word/2010/wordprocessingGroup" xmlns:wpi="http://schemas.microsoft.com/office/word/2010/wordprocessingInk" xmlns:wne="http://schemas.microsoft.com/office/word/2006/wordml" xmlns:wps="http://schemas.microsoft.com/office/word/2010/wordprocessingShape" mc:Ignorable="w14 w15 wp14">
   <w:endnote w:type="separator" w:id="-1">
     <w:p>
       <w:pPr>
@@ -758,7 +1263,7 @@
 </file>
 
 <file path=word/footer1.xml><?xml version="1.0" encoding="utf-8"?>
-<w:ftr xmlns:wpc="http://schemas.microsoft.com/office/word/2010/wordprocessingCanvas" xmlns:cx="http://schemas.microsoft.com/office/drawing/2014/chartex" xmlns:cx1="http://schemas.microsoft.com/office/drawing/2015/9/8/chartex" xmlns:cx2="http://schemas.microsoft.com/office/drawing/2015/10/21/chartex" xmlns:cx3="http://schemas.microsoft.com/office/drawing/2016/5/9/chartex" xmlns:cx4="http://schemas.microsoft.com/office/drawing/2016/5/10/chartex" xmlns:cx5="http://schemas.microsoft.com/office/drawing/2016/5/11/chartex" xmlns:cx6="http://schemas.microsoft.com/office/drawing/2016/5/12/chartex" xmlns:cx7="http://schemas.microsoft.com/office/drawing/2016/5/13/chartex" xmlns:cx8="http://schemas.microsoft.com/office/drawing/2016/5/14/chartex" xmlns:mc="http://schemas.openxmlformats.org/markup-compatibility/2006" xmlns:aink="http://schemas.microsoft.com/office/drawing/2016/ink" xmlns:am3d="http://schemas.microsoft.com/office/drawing/2017/model3d" xmlns:o="urn:schemas-microsoft-com:office:office" xmlns:oel="http://schemas.microsoft.com/office/2019/extlst" xmlns:r="http://schemas.openxmlformats.org/officeDocument/2006/relationships" xmlns:m="http://schemas.openxmlformats.org/officeDocument/2006/math" xmlns:v="urn:schemas-microsoft-com:vml" xmlns:wp14="http://schemas.microsoft.com/office/word/2010/wordprocessingDrawing" xmlns:wp="http://schemas.openxmlformats.org/drawingml/2006/wordprocessingDrawing" xmlns:w10="urn:schemas-microsoft-com:office:word" xmlns:w="http://schemas.openxmlformats.org/wordprocessingml/2006/main" xmlns:w14="http://schemas.microsoft.com/office/word/2010/wordml" xmlns:w15="http://schemas.microsoft.com/office/word/2012/wordml" xmlns:w16cex="http://schemas.microsoft.com/office/word/2018/wordml/cex" xmlns:w16cid="http://schemas.microsoft.com/office/word/2016/wordml/cid" xmlns:w16="http://schemas.microsoft.com/office/word/2018/wordml" xmlns:w16du="http://schemas.microsoft.com/office/word/2023/wordml/word16du" xmlns:w16sdtdh="http://schemas.microsoft.com/office/word/2020/wordml/sdtdatahash" xmlns:w16sdtfl="http://schemas.microsoft.com/office/word/2024/wordml/sdtformatlock" xmlns:w16se="http://schemas.microsoft.com/office/word/2015/wordml/symex" xmlns:wpg="http://schemas.microsoft.com/office/word/2010/wordprocessingGroup" xmlns:wpi="http://schemas.microsoft.com/office/word/2010/wordprocessingInk" xmlns:wne="http://schemas.microsoft.com/office/word/2006/wordml" xmlns:wps="http://schemas.microsoft.com/office/word/2010/wordprocessingShape" mc:Ignorable="w14 w15 w16se w16cid w16 w16cex w16sdtdh w16sdtfl w16du wp14">
+<w:ftr xmlns:wpc="http://schemas.microsoft.com/office/word/2010/wordprocessingCanvas" xmlns:mc="http://schemas.openxmlformats.org/markup-compatibility/2006" xmlns:o="urn:schemas-microsoft-com:office:office" xmlns:r="http://schemas.openxmlformats.org/officeDocument/2006/relationships" xmlns:m="http://schemas.openxmlformats.org/officeDocument/2006/math" xmlns:v="urn:schemas-microsoft-com:vml" xmlns:wp14="http://schemas.microsoft.com/office/word/2010/wordprocessingDrawing" xmlns:wp="http://schemas.openxmlformats.org/drawingml/2006/wordprocessingDrawing" xmlns:w10="urn:schemas-microsoft-com:office:word" xmlns:w="http://schemas.openxmlformats.org/wordprocessingml/2006/main" xmlns:w14="http://schemas.microsoft.com/office/word/2010/wordml" xmlns:w15="http://schemas.microsoft.com/office/word/2012/wordml" xmlns:wpg="http://schemas.microsoft.com/office/word/2010/wordprocessingGroup" xmlns:wpi="http://schemas.microsoft.com/office/word/2010/wordprocessingInk" xmlns:wne="http://schemas.microsoft.com/office/word/2006/wordml" xmlns:wps="http://schemas.microsoft.com/office/word/2010/wordprocessingShape" mc:Ignorable="w14 w15 wp14">
   <w:p>
     <w:pPr>
       <w:pBdr>
@@ -887,14 +1392,23 @@
         <w:sz w:val="16"/>
         <w:szCs w:val="16"/>
       </w:rPr>
-      <w:t>DSWD | (CLUSTER NAME / FIELD OFFICE NO.) | (OFFICE NAME)</w:t>
+      <w:t xml:space="preserve">DSWD | (CLUSTER NAME / </w:t>
+    </w:r>
+    <w:r>
+      <w:rPr>
+        <w:rFonts w:ascii="Times New Roman" w:eastAsia="Times New Roman" w:hAnsi="Times New Roman" w:cs="Times New Roman"/>
+        <w:b/>
+        <w:sz w:val="16"/>
+        <w:szCs w:val="16"/>
+      </w:rPr>
+      <w:t>FIELD OFFICE NO.) | (OFFICE NAME)</w:t>
     </w:r>
   </w:p>
 </w:ftr>
 </file>
 
 <file path=word/footer2.xml><?xml version="1.0" encoding="utf-8"?>
-<w:ftr xmlns:wpc="http://schemas.microsoft.com/office/word/2010/wordprocessingCanvas" xmlns:cx="http://schemas.microsoft.com/office/drawing/2014/chartex" xmlns:cx1="http://schemas.microsoft.com/office/drawing/2015/9/8/chartex" xmlns:cx2="http://schemas.microsoft.com/office/drawing/2015/10/21/chartex" xmlns:cx3="http://schemas.microsoft.com/office/drawing/2016/5/9/chartex" xmlns:cx4="http://schemas.microsoft.com/office/drawing/2016/5/10/chartex" xmlns:cx5="http://schemas.microsoft.com/office/drawing/2016/5/11/chartex" xmlns:cx6="http://schemas.microsoft.com/office/drawing/2016/5/12/chartex" xmlns:cx7="http://schemas.microsoft.com/office/drawing/2016/5/13/chartex" xmlns:cx8="http://schemas.microsoft.com/office/drawing/2016/5/14/chartex" xmlns:mc="http://schemas.openxmlformats.org/markup-compatibility/2006" xmlns:aink="http://schemas.microsoft.com/office/drawing/2016/ink" xmlns:am3d="http://schemas.microsoft.com/office/drawing/2017/model3d" xmlns:o="urn:schemas-microsoft-com:office:office" xmlns:oel="http://schemas.microsoft.com/office/2019/extlst" xmlns:r="http://schemas.openxmlformats.org/officeDocument/2006/relationships" xmlns:m="http://schemas.openxmlformats.org/officeDocument/2006/math" xmlns:v="urn:schemas-microsoft-com:vml" xmlns:wp14="http://schemas.microsoft.com/office/word/2010/wordprocessingDrawing" xmlns:wp="http://schemas.openxmlformats.org/drawingml/2006/wordprocessingDrawing" xmlns:w10="urn:schemas-microsoft-com:office:word" xmlns:w="http://schemas.openxmlformats.org/wordprocessingml/2006/main" xmlns:w14="http://schemas.microsoft.com/office/word/2010/wordml" xmlns:w15="http://schemas.microsoft.com/office/word/2012/wordml" xmlns:w16cex="http://schemas.microsoft.com/office/word/2018/wordml/cex" xmlns:w16cid="http://schemas.microsoft.com/office/word/2016/wordml/cid" xmlns:w16="http://schemas.microsoft.com/office/word/2018/wordml" xmlns:w16du="http://schemas.microsoft.com/office/word/2023/wordml/word16du" xmlns:w16sdtdh="http://schemas.microsoft.com/office/word/2020/wordml/sdtdatahash" xmlns:w16sdtfl="http://schemas.microsoft.com/office/word/2024/wordml/sdtformatlock" xmlns:w16se="http://schemas.microsoft.com/office/word/2015/wordml/symex" xmlns:wpg="http://schemas.microsoft.com/office/word/2010/wordprocessingGroup" xmlns:wpi="http://schemas.microsoft.com/office/word/2010/wordprocessingInk" xmlns:wne="http://schemas.microsoft.com/office/word/2006/wordml" xmlns:wps="http://schemas.microsoft.com/office/word/2010/wordprocessingShape" mc:Ignorable="w14 w15 w16se w16cid w16 w16cex w16sdtdh w16sdtfl w16du wp14">
+<w:ftr xmlns:wpc="http://schemas.microsoft.com/office/word/2010/wordprocessingCanvas" xmlns:mc="http://schemas.openxmlformats.org/markup-compatibility/2006" xmlns:o="urn:schemas-microsoft-com:office:office" xmlns:r="http://schemas.openxmlformats.org/officeDocument/2006/relationships" xmlns:m="http://schemas.openxmlformats.org/officeDocument/2006/math" xmlns:v="urn:schemas-microsoft-com:vml" xmlns:wp14="http://schemas.microsoft.com/office/word/2010/wordprocessingDrawing" xmlns:wp="http://schemas.openxmlformats.org/drawingml/2006/wordprocessingDrawing" xmlns:w10="urn:schemas-microsoft-com:office:word" xmlns:w="http://schemas.openxmlformats.org/wordprocessingml/2006/main" xmlns:w14="http://schemas.microsoft.com/office/word/2010/wordml" xmlns:w15="http://schemas.microsoft.com/office/word/2012/wordml" xmlns:wpg="http://schemas.microsoft.com/office/word/2010/wordprocessingGroup" xmlns:wpi="http://schemas.microsoft.com/office/word/2010/wordprocessingInk" xmlns:wne="http://schemas.microsoft.com/office/word/2006/wordml" xmlns:wps="http://schemas.microsoft.com/office/word/2010/wordprocessingShape" mc:Ignorable="w14 w15 wp14">
   <w:p>
     <w:pPr>
       <w:pBdr>
@@ -954,6 +1468,7 @@
       <w:rPr>
         <w:rFonts w:ascii="Times New Roman" w:eastAsia="Times New Roman" w:hAnsi="Times New Roman" w:cs="Times New Roman"/>
         <w:b/>
+        <w:noProof/>
         <w:sz w:val="16"/>
         <w:szCs w:val="16"/>
       </w:rPr>
@@ -1008,6 +1523,7 @@
       <w:rPr>
         <w:rFonts w:ascii="Times New Roman" w:eastAsia="Times New Roman" w:hAnsi="Times New Roman" w:cs="Times New Roman"/>
         <w:b/>
+        <w:noProof/>
         <w:sz w:val="16"/>
         <w:szCs w:val="16"/>
       </w:rPr>
@@ -1048,7 +1564,7 @@
 </file>
 
 <file path=word/footer3.xml><?xml version="1.0" encoding="utf-8"?>
-<w:ftr xmlns:wpc="http://schemas.microsoft.com/office/word/2010/wordprocessingCanvas" xmlns:cx="http://schemas.microsoft.com/office/drawing/2014/chartex" xmlns:cx1="http://schemas.microsoft.com/office/drawing/2015/9/8/chartex" xmlns:cx2="http://schemas.microsoft.com/office/drawing/2015/10/21/chartex" xmlns:cx3="http://schemas.microsoft.com/office/drawing/2016/5/9/chartex" xmlns:cx4="http://schemas.microsoft.com/office/drawing/2016/5/10/chartex" xmlns:cx5="http://schemas.microsoft.com/office/drawing/2016/5/11/chartex" xmlns:cx6="http://schemas.microsoft.com/office/drawing/2016/5/12/chartex" xmlns:cx7="http://schemas.microsoft.com/office/drawing/2016/5/13/chartex" xmlns:cx8="http://schemas.microsoft.com/office/drawing/2016/5/14/chartex" xmlns:mc="http://schemas.openxmlformats.org/markup-compatibility/2006" xmlns:aink="http://schemas.microsoft.com/office/drawing/2016/ink" xmlns:am3d="http://schemas.microsoft.com/office/drawing/2017/model3d" xmlns:o="urn:schemas-microsoft-com:office:office" xmlns:oel="http://schemas.microsoft.com/office/2019/extlst" xmlns:r="http://schemas.openxmlformats.org/officeDocument/2006/relationships" xmlns:m="http://schemas.openxmlformats.org/officeDocument/2006/math" xmlns:v="urn:schemas-microsoft-com:vml" xmlns:wp14="http://schemas.microsoft.com/office/word/2010/wordprocessingDrawing" xmlns:wp="http://schemas.openxmlformats.org/drawingml/2006/wordprocessingDrawing" xmlns:w10="urn:schemas-microsoft-com:office:word" xmlns:w="http://schemas.openxmlformats.org/wordprocessingml/2006/main" xmlns:w14="http://schemas.microsoft.com/office/word/2010/wordml" xmlns:w15="http://schemas.microsoft.com/office/word/2012/wordml" xmlns:w16cex="http://schemas.microsoft.com/office/word/2018/wordml/cex" xmlns:w16cid="http://schemas.microsoft.com/office/word/2016/wordml/cid" xmlns:w16="http://schemas.microsoft.com/office/word/2018/wordml" xmlns:w16du="http://schemas.microsoft.com/office/word/2023/wordml/word16du" xmlns:w16sdtdh="http://schemas.microsoft.com/office/word/2020/wordml/sdtdatahash" xmlns:w16sdtfl="http://schemas.microsoft.com/office/word/2024/wordml/sdtformatlock" xmlns:w16se="http://schemas.microsoft.com/office/word/2015/wordml/symex" xmlns:wpg="http://schemas.microsoft.com/office/word/2010/wordprocessingGroup" xmlns:wpi="http://schemas.microsoft.com/office/word/2010/wordprocessingInk" xmlns:wne="http://schemas.microsoft.com/office/word/2006/wordml" xmlns:wps="http://schemas.microsoft.com/office/word/2010/wordprocessingShape" mc:Ignorable="w14 w15 w16se w16cid w16 w16cex w16sdtdh w16sdtfl w16du wp14">
+<w:ftr xmlns:wpc="http://schemas.microsoft.com/office/word/2010/wordprocessingCanvas" xmlns:mc="http://schemas.openxmlformats.org/markup-compatibility/2006" xmlns:o="urn:schemas-microsoft-com:office:office" xmlns:r="http://schemas.openxmlformats.org/officeDocument/2006/relationships" xmlns:m="http://schemas.openxmlformats.org/officeDocument/2006/math" xmlns:v="urn:schemas-microsoft-com:vml" xmlns:wp14="http://schemas.microsoft.com/office/word/2010/wordprocessingDrawing" xmlns:wp="http://schemas.openxmlformats.org/drawingml/2006/wordprocessingDrawing" xmlns:w10="urn:schemas-microsoft-com:office:word" xmlns:w="http://schemas.openxmlformats.org/wordprocessingml/2006/main" xmlns:w14="http://schemas.microsoft.com/office/word/2010/wordml" xmlns:w15="http://schemas.microsoft.com/office/word/2012/wordml" xmlns:wpg="http://schemas.microsoft.com/office/word/2010/wordprocessingGroup" xmlns:wpi="http://schemas.microsoft.com/office/word/2010/wordprocessingInk" xmlns:wne="http://schemas.microsoft.com/office/word/2006/wordml" xmlns:wps="http://schemas.microsoft.com/office/word/2010/wordprocessingShape" mc:Ignorable="w14 w15 wp14">
   <w:p>
     <w:pPr>
       <w:pBdr>
@@ -1111,6 +1627,7 @@
       <w:rPr>
         <w:rFonts w:ascii="Times New Roman" w:eastAsia="Times New Roman" w:hAnsi="Times New Roman" w:cs="Times New Roman"/>
         <w:b/>
+        <w:noProof/>
         <w:color w:val="000000"/>
         <w:sz w:val="16"/>
         <w:szCs w:val="16"/>
@@ -1171,6 +1688,7 @@
       <w:rPr>
         <w:rFonts w:ascii="Times New Roman" w:eastAsia="Times New Roman" w:hAnsi="Times New Roman" w:cs="Times New Roman"/>
         <w:b/>
+        <w:noProof/>
         <w:color w:val="000000"/>
         <w:sz w:val="16"/>
         <w:szCs w:val="16"/>
@@ -1193,6 +1711,7 @@
       <w:tag w:val="goog_rdk_1"/>
       <w:id w:val="-1420714285"/>
     </w:sdtPr>
+    <w:sdtEndPr/>
     <w:sdtContent>
       <w:p>
         <w:pPr>
@@ -1211,6 +1730,7 @@
             <w:tag w:val="goog_rdk_1"/>
             <w:id w:val="1596125161"/>
           </w:sdtPr>
+          <w:sdtEndPr/>
           <w:sdtContent>
             <w:r>
               <w:rPr>
@@ -1218,7 +1738,15 @@
                 <w:sz w:val="16"/>
                 <w:szCs w:val="16"/>
               </w:rPr>
-              <w:t>DSWD Field Office Caraga, R. Palma Street, Butuan City, Philippines 8600</w:t>
+              <w:t xml:space="preserve">DSWD Field Office Caraga, R. </w:t>
+            </w:r>
+            <w:r>
+              <w:rPr>
+                <w:rFonts w:ascii="Times New Roman" w:eastAsia="Times New Roman" w:hAnsi="Times New Roman"/>
+                <w:sz w:val="16"/>
+                <w:szCs w:val="16"/>
+              </w:rPr>
+              <w:t>Palma Street, Butuan City, Philippines 8600</w:t>
             </w:r>
             <w:r>
               <w:rPr>
@@ -1277,7 +1805,7 @@
 </file>
 
 <file path=word/footnotes.xml><?xml version="1.0" encoding="utf-8"?>
-<w:footnotes xmlns:wpc="http://schemas.microsoft.com/office/word/2010/wordprocessingCanvas" xmlns:cx="http://schemas.microsoft.com/office/drawing/2014/chartex" xmlns:cx1="http://schemas.microsoft.com/office/drawing/2015/9/8/chartex" xmlns:cx2="http://schemas.microsoft.com/office/drawing/2015/10/21/chartex" xmlns:cx3="http://schemas.microsoft.com/office/drawing/2016/5/9/chartex" xmlns:cx4="http://schemas.microsoft.com/office/drawing/2016/5/10/chartex" xmlns:cx5="http://schemas.microsoft.com/office/drawing/2016/5/11/chartex" xmlns:cx6="http://schemas.microsoft.com/office/drawing/2016/5/12/chartex" xmlns:cx7="http://schemas.microsoft.com/office/drawing/2016/5/13/chartex" xmlns:cx8="http://schemas.microsoft.com/office/drawing/2016/5/14/chartex" xmlns:mc="http://schemas.openxmlformats.org/markup-compatibility/2006" xmlns:aink="http://schemas.microsoft.com/office/drawing/2016/ink" xmlns:am3d="http://schemas.microsoft.com/office/drawing/2017/model3d" xmlns:o="urn:schemas-microsoft-com:office:office" xmlns:oel="http://schemas.microsoft.com/office/2019/extlst" xmlns:r="http://schemas.openxmlformats.org/officeDocument/2006/relationships" xmlns:m="http://schemas.openxmlformats.org/officeDocument/2006/math" xmlns:v="urn:schemas-microsoft-com:vml" xmlns:wp14="http://schemas.microsoft.com/office/word/2010/wordprocessingDrawing" xmlns:wp="http://schemas.openxmlformats.org/drawingml/2006/wordprocessingDrawing" xmlns:w10="urn:schemas-microsoft-com:office:word" xmlns:w="http://schemas.openxmlformats.org/wordprocessingml/2006/main" xmlns:w14="http://schemas.microsoft.com/office/word/2010/wordml" xmlns:w15="http://schemas.microsoft.com/office/word/2012/wordml" xmlns:w16cex="http://schemas.microsoft.com/office/word/2018/wordml/cex" xmlns:w16cid="http://schemas.microsoft.com/office/word/2016/wordml/cid" xmlns:w16="http://schemas.microsoft.com/office/word/2018/wordml" xmlns:w16du="http://schemas.microsoft.com/office/word/2023/wordml/word16du" xmlns:w16sdtdh="http://schemas.microsoft.com/office/word/2020/wordml/sdtdatahash" xmlns:w16sdtfl="http://schemas.microsoft.com/office/word/2024/wordml/sdtformatlock" xmlns:w16se="http://schemas.microsoft.com/office/word/2015/wordml/symex" xmlns:wpg="http://schemas.microsoft.com/office/word/2010/wordprocessingGroup" xmlns:wpi="http://schemas.microsoft.com/office/word/2010/wordprocessingInk" xmlns:wne="http://schemas.microsoft.com/office/word/2006/wordml" xmlns:wps="http://schemas.microsoft.com/office/word/2010/wordprocessingShape" mc:Ignorable="w14 w15 w16se w16cid w16 w16cex w16sdtdh w16sdtfl w16du wp14">
+<w:footnotes xmlns:wpc="http://schemas.microsoft.com/office/word/2010/wordprocessingCanvas" xmlns:mc="http://schemas.openxmlformats.org/markup-compatibility/2006" xmlns:o="urn:schemas-microsoft-com:office:office" xmlns:r="http://schemas.openxmlformats.org/officeDocument/2006/relationships" xmlns:m="http://schemas.openxmlformats.org/officeDocument/2006/math" xmlns:v="urn:schemas-microsoft-com:vml" xmlns:wp14="http://schemas.microsoft.com/office/word/2010/wordprocessingDrawing" xmlns:wp="http://schemas.openxmlformats.org/drawingml/2006/wordprocessingDrawing" xmlns:w10="urn:schemas-microsoft-com:office:word" xmlns:w="http://schemas.openxmlformats.org/wordprocessingml/2006/main" xmlns:w14="http://schemas.microsoft.com/office/word/2010/wordml" xmlns:w15="http://schemas.microsoft.com/office/word/2012/wordml" xmlns:wpg="http://schemas.microsoft.com/office/word/2010/wordprocessingGroup" xmlns:wpi="http://schemas.microsoft.com/office/word/2010/wordprocessingInk" xmlns:wne="http://schemas.microsoft.com/office/word/2006/wordml" xmlns:wps="http://schemas.microsoft.com/office/word/2010/wordprocessingShape" mc:Ignorable="w14 w15 wp14">
   <w:footnote w:type="separator" w:id="-1">
     <w:p>
       <w:pPr>
@@ -1302,7 +1830,7 @@
 </file>
 
 <file path=word/header1.xml><?xml version="1.0" encoding="utf-8"?>
-<w:hdr xmlns:wpc="http://schemas.microsoft.com/office/word/2010/wordprocessingCanvas" xmlns:cx="http://schemas.microsoft.com/office/drawing/2014/chartex" xmlns:cx1="http://schemas.microsoft.com/office/drawing/2015/9/8/chartex" xmlns:cx2="http://schemas.microsoft.com/office/drawing/2015/10/21/chartex" xmlns:cx3="http://schemas.microsoft.com/office/drawing/2016/5/9/chartex" xmlns:cx4="http://schemas.microsoft.com/office/drawing/2016/5/10/chartex" xmlns:cx5="http://schemas.microsoft.com/office/drawing/2016/5/11/chartex" xmlns:cx6="http://schemas.microsoft.com/office/drawing/2016/5/12/chartex" xmlns:cx7="http://schemas.microsoft.com/office/drawing/2016/5/13/chartex" xmlns:cx8="http://schemas.microsoft.com/office/drawing/2016/5/14/chartex" xmlns:mc="http://schemas.openxmlformats.org/markup-compatibility/2006" xmlns:aink="http://schemas.microsoft.com/office/drawing/2016/ink" xmlns:am3d="http://schemas.microsoft.com/office/drawing/2017/model3d" xmlns:o="urn:schemas-microsoft-com:office:office" xmlns:oel="http://schemas.microsoft.com/office/2019/extlst" xmlns:r="http://schemas.openxmlformats.org/officeDocument/2006/relationships" xmlns:m="http://schemas.openxmlformats.org/officeDocument/2006/math" xmlns:v="urn:schemas-microsoft-com:vml" xmlns:wp14="http://schemas.microsoft.com/office/word/2010/wordprocessingDrawing" xmlns:wp="http://schemas.openxmlformats.org/drawingml/2006/wordprocessingDrawing" xmlns:w10="urn:schemas-microsoft-com:office:word" xmlns:w="http://schemas.openxmlformats.org/wordprocessingml/2006/main" xmlns:w14="http://schemas.microsoft.com/office/word/2010/wordml" xmlns:w15="http://schemas.microsoft.com/office/word/2012/wordml" xmlns:w16cex="http://schemas.microsoft.com/office/word/2018/wordml/cex" xmlns:w16cid="http://schemas.microsoft.com/office/word/2016/wordml/cid" xmlns:w16="http://schemas.microsoft.com/office/word/2018/wordml" xmlns:w16du="http://schemas.microsoft.com/office/word/2023/wordml/word16du" xmlns:w16sdtdh="http://schemas.microsoft.com/office/word/2020/wordml/sdtdatahash" xmlns:w16sdtfl="http://schemas.microsoft.com/office/word/2024/wordml/sdtformatlock" xmlns:w16se="http://schemas.microsoft.com/office/word/2015/wordml/symex" xmlns:wpg="http://schemas.microsoft.com/office/word/2010/wordprocessingGroup" xmlns:wpi="http://schemas.microsoft.com/office/word/2010/wordprocessingInk" xmlns:wne="http://schemas.microsoft.com/office/word/2006/wordml" xmlns:wps="http://schemas.microsoft.com/office/word/2010/wordprocessingShape" mc:Ignorable="w14 w15 w16se w16cid w16 w16cex w16sdtdh w16sdtfl w16du wp14">
+<w:hdr xmlns:wpc="http://schemas.microsoft.com/office/word/2010/wordprocessingCanvas" xmlns:mc="http://schemas.openxmlformats.org/markup-compatibility/2006" xmlns:o="urn:schemas-microsoft-com:office:office" xmlns:r="http://schemas.openxmlformats.org/officeDocument/2006/relationships" xmlns:m="http://schemas.openxmlformats.org/officeDocument/2006/math" xmlns:v="urn:schemas-microsoft-com:vml" xmlns:wp14="http://schemas.microsoft.com/office/word/2010/wordprocessingDrawing" xmlns:wp="http://schemas.openxmlformats.org/drawingml/2006/wordprocessingDrawing" xmlns:w10="urn:schemas-microsoft-com:office:word" xmlns:w="http://schemas.openxmlformats.org/wordprocessingml/2006/main" xmlns:w14="http://schemas.microsoft.com/office/word/2010/wordml" xmlns:w15="http://schemas.microsoft.com/office/word/2012/wordml" xmlns:wpg="http://schemas.microsoft.com/office/word/2010/wordprocessingGroup" xmlns:wpi="http://schemas.microsoft.com/office/word/2010/wordprocessingInk" xmlns:wne="http://schemas.microsoft.com/office/word/2006/wordml" xmlns:wps="http://schemas.microsoft.com/office/word/2010/wordprocessingShape" mc:Ignorable="w14 w15 wp14">
   <w:p>
     <w:pPr>
       <w:spacing w:after="0" w:line="240" w:lineRule="auto"/>
@@ -1333,8 +1861,8 @@
         <w:color w:val="000000"/>
       </w:rPr>
     </w:pPr>
-    <w:bookmarkStart w:id="0" w:name="_heading=h.30j0zll" w:colFirst="0" w:colLast="0"/>
-    <w:bookmarkEnd w:id="0"/>
+    <w:bookmarkStart w:id="1" w:name="_heading=h.30j0zll" w:colFirst="0" w:colLast="0"/>
+    <w:bookmarkEnd w:id="1"/>
     <w:r>
       <w:rPr>
         <w:rFonts w:ascii="Arial" w:eastAsia="Arial" w:hAnsi="Arial" w:cs="Arial"/>
@@ -1369,7 +1897,7 @@
 </file>
 
 <file path=word/header2.xml><?xml version="1.0" encoding="utf-8"?>
-<w:hdr xmlns:wpc="http://schemas.microsoft.com/office/word/2010/wordprocessingCanvas" xmlns:cx="http://schemas.microsoft.com/office/drawing/2014/chartex" xmlns:cx1="http://schemas.microsoft.com/office/drawing/2015/9/8/chartex" xmlns:cx2="http://schemas.microsoft.com/office/drawing/2015/10/21/chartex" xmlns:cx3="http://schemas.microsoft.com/office/drawing/2016/5/9/chartex" xmlns:cx4="http://schemas.microsoft.com/office/drawing/2016/5/10/chartex" xmlns:cx5="http://schemas.microsoft.com/office/drawing/2016/5/11/chartex" xmlns:cx6="http://schemas.microsoft.com/office/drawing/2016/5/12/chartex" xmlns:cx7="http://schemas.microsoft.com/office/drawing/2016/5/13/chartex" xmlns:cx8="http://schemas.microsoft.com/office/drawing/2016/5/14/chartex" xmlns:mc="http://schemas.openxmlformats.org/markup-compatibility/2006" xmlns:aink="http://schemas.microsoft.com/office/drawing/2016/ink" xmlns:am3d="http://schemas.microsoft.com/office/drawing/2017/model3d" xmlns:o="urn:schemas-microsoft-com:office:office" xmlns:oel="http://schemas.microsoft.com/office/2019/extlst" xmlns:r="http://schemas.openxmlformats.org/officeDocument/2006/relationships" xmlns:m="http://schemas.openxmlformats.org/officeDocument/2006/math" xmlns:v="urn:schemas-microsoft-com:vml" xmlns:wp14="http://schemas.microsoft.com/office/word/2010/wordprocessingDrawing" xmlns:wp="http://schemas.openxmlformats.org/drawingml/2006/wordprocessingDrawing" xmlns:w10="urn:schemas-microsoft-com:office:word" xmlns:w="http://schemas.openxmlformats.org/wordprocessingml/2006/main" xmlns:w14="http://schemas.microsoft.com/office/word/2010/wordml" xmlns:w15="http://schemas.microsoft.com/office/word/2012/wordml" xmlns:w16cex="http://schemas.microsoft.com/office/word/2018/wordml/cex" xmlns:w16cid="http://schemas.microsoft.com/office/word/2016/wordml/cid" xmlns:w16="http://schemas.microsoft.com/office/word/2018/wordml" xmlns:w16du="http://schemas.microsoft.com/office/word/2023/wordml/word16du" xmlns:w16sdtdh="http://schemas.microsoft.com/office/word/2020/wordml/sdtdatahash" xmlns:w16sdtfl="http://schemas.microsoft.com/office/word/2024/wordml/sdtformatlock" xmlns:w16se="http://schemas.microsoft.com/office/word/2015/wordml/symex" xmlns:wpg="http://schemas.microsoft.com/office/word/2010/wordprocessingGroup" xmlns:wpi="http://schemas.microsoft.com/office/word/2010/wordprocessingInk" xmlns:wne="http://schemas.microsoft.com/office/word/2006/wordml" xmlns:wps="http://schemas.microsoft.com/office/word/2010/wordprocessingShape" mc:Ignorable="w14 w15 w16se w16cid w16 w16cex w16sdtdh w16sdtfl w16du wp14">
+<w:hdr xmlns:wpc="http://schemas.microsoft.com/office/word/2010/wordprocessingCanvas" xmlns:mc="http://schemas.openxmlformats.org/markup-compatibility/2006" xmlns:o="urn:schemas-microsoft-com:office:office" xmlns:r="http://schemas.openxmlformats.org/officeDocument/2006/relationships" xmlns:m="http://schemas.openxmlformats.org/officeDocument/2006/math" xmlns:v="urn:schemas-microsoft-com:vml" xmlns:wp14="http://schemas.microsoft.com/office/word/2010/wordprocessingDrawing" xmlns:wp="http://schemas.openxmlformats.org/drawingml/2006/wordprocessingDrawing" xmlns:w10="urn:schemas-microsoft-com:office:word" xmlns:w="http://schemas.openxmlformats.org/wordprocessingml/2006/main" xmlns:w14="http://schemas.microsoft.com/office/word/2010/wordml" xmlns:w15="http://schemas.microsoft.com/office/word/2012/wordml" xmlns:wpg="http://schemas.microsoft.com/office/word/2010/wordprocessingGroup" xmlns:wpi="http://schemas.microsoft.com/office/word/2010/wordprocessingInk" xmlns:wne="http://schemas.microsoft.com/office/word/2006/wordml" xmlns:wps="http://schemas.microsoft.com/office/word/2010/wordprocessingShape" mc:Ignorable="w14 w15 wp14">
   <w:p>
     <w:pPr>
       <w:spacing w:after="0" w:line="240" w:lineRule="auto"/>
@@ -1382,24 +1910,6 @@
       </w:rPr>
     </w:pPr>
   </w:p>
-  <w:p>
-    <w:pPr>
-      <w:spacing w:after="0" w:line="240" w:lineRule="auto"/>
-      <w:ind w:firstLine="0"/>
-      <w:jc w:val="right"/>
-      <w:rPr>
-        <w:rFonts w:ascii="Times New Roman" w:eastAsia="Times New Roman" w:hAnsi="Times New Roman" w:cs="Times New Roman"/>
-        <w:i/>
-        <w:sz w:val="16"/>
-        <w:szCs w:val="16"/>
-      </w:rPr>
-    </w:pPr>
-  </w:p>
-</w:hdr>
-</file>
-
-<file path=word/header3.xml><?xml version="1.0" encoding="utf-8"?>
-<w:hdr xmlns:wpc="http://schemas.microsoft.com/office/word/2010/wordprocessingCanvas" xmlns:cx="http://schemas.microsoft.com/office/drawing/2014/chartex" xmlns:cx1="http://schemas.microsoft.com/office/drawing/2015/9/8/chartex" xmlns:cx2="http://schemas.microsoft.com/office/drawing/2015/10/21/chartex" xmlns:cx3="http://schemas.microsoft.com/office/drawing/2016/5/9/chartex" xmlns:cx4="http://schemas.microsoft.com/office/drawing/2016/5/10/chartex" xmlns:cx5="http://schemas.microsoft.com/office/drawing/2016/5/11/chartex" xmlns:cx6="http://schemas.microsoft.com/office/drawing/2016/5/12/chartex" xmlns:cx7="http://schemas.microsoft.com/office/drawing/2016/5/13/chartex" xmlns:cx8="http://schemas.microsoft.com/office/drawing/2016/5/14/chartex" xmlns:mc="http://schemas.openxmlformats.org/markup-compatibility/2006" xmlns:aink="http://schemas.microsoft.com/office/drawing/2016/ink" xmlns:am3d="http://schemas.microsoft.com/office/drawing/2017/model3d" xmlns:o="urn:schemas-microsoft-com:office:office" xmlns:oel="http://schemas.microsoft.com/office/2019/extlst" xmlns:r="http://schemas.openxmlformats.org/officeDocument/2006/relationships" xmlns:m="http://schemas.openxmlformats.org/officeDocument/2006/math" xmlns:v="urn:schemas-microsoft-com:vml" xmlns:wp14="http://schemas.microsoft.com/office/word/2010/wordprocessingDrawing" xmlns:wp="http://schemas.openxmlformats.org/drawingml/2006/wordprocessingDrawing" xmlns:w10="urn:schemas-microsoft-com:office:word" xmlns:w="http://schemas.openxmlformats.org/wordprocessingml/2006/main" xmlns:w14="http://schemas.microsoft.com/office/word/2010/wordml" xmlns:w15="http://schemas.microsoft.com/office/word/2012/wordml" xmlns:w16cex="http://schemas.microsoft.com/office/word/2018/wordml/cex" xmlns:w16cid="http://schemas.microsoft.com/office/word/2016/wordml/cid" xmlns:w16="http://schemas.microsoft.com/office/word/2018/wordml" xmlns:w16du="http://schemas.microsoft.com/office/word/2023/wordml/word16du" xmlns:w16sdtdh="http://schemas.microsoft.com/office/word/2020/wordml/sdtdatahash" xmlns:w16sdtfl="http://schemas.microsoft.com/office/word/2024/wordml/sdtformatlock" xmlns:w16se="http://schemas.microsoft.com/office/word/2015/wordml/symex" xmlns:wpg="http://schemas.microsoft.com/office/word/2010/wordprocessingGroup" xmlns:wpi="http://schemas.microsoft.com/office/word/2010/wordprocessingInk" xmlns:wne="http://schemas.microsoft.com/office/word/2006/wordml" xmlns:wps="http://schemas.microsoft.com/office/word/2010/wordprocessingShape" mc:Ignorable="w14 w15 w16se w16cid w16 w16cex w16sdtdh w16sdtfl w16du wp14">
   <w:p>
     <w:pPr>
       <w:widowControl w:val="0"/>
@@ -1412,7 +1922,6 @@
         <w:szCs w:val="24"/>
       </w:rPr>
     </w:pPr>
-    <w:bookmarkStart w:id="1" w:name="_Hlk191635190"/>
   </w:p>
   <w:tbl>
     <w:tblPr>
@@ -1447,9 +1956,758 @@
               <w:color w:val="000000"/>
             </w:rPr>
           </w:pPr>
-          <w:bookmarkStart w:id="2" w:name="_heading=h.1fob9te" w:colFirst="0" w:colLast="0"/>
-          <w:bookmarkEnd w:id="1"/>
+          <w:r>
+            <w:rPr>
+              <w:rFonts w:ascii="Arial" w:eastAsia="Arial" w:hAnsi="Arial" w:cs="Arial"/>
+              <w:i/>
+              <w:noProof/>
+              <w:sz w:val="24"/>
+              <w:szCs w:val="24"/>
+              <w:lang w:val="en-US" w:eastAsia="en-US"/>
+            </w:rPr>
+            <w:drawing>
+              <wp:anchor distT="0" distB="0" distL="114300" distR="114300" simplePos="0" relativeHeight="251665408" behindDoc="0" locked="0" layoutInCell="1" allowOverlap="1" wp14:anchorId="0D26FA06" wp14:editId="2B527A91">
+                <wp:simplePos x="0" y="0"/>
+                <wp:positionH relativeFrom="column">
+                  <wp:posOffset>-145415</wp:posOffset>
+                </wp:positionH>
+                <wp:positionV relativeFrom="paragraph">
+                  <wp:posOffset>-153035</wp:posOffset>
+                </wp:positionV>
+                <wp:extent cx="1760220" cy="693420"/>
+                <wp:effectExtent l="0" t="0" r="0" b="0"/>
+                <wp:wrapNone/>
+                <wp:docPr id="19" name="Picture 19" descr="C:\Users\rglamigo\AppData\Local\Microsoft\Windows\INetCache\Content.Word\Final DSWD logo_figurative_colored.png"/>
+                <wp:cNvGraphicFramePr>
+                  <a:graphicFrameLocks xmlns:a="http://schemas.openxmlformats.org/drawingml/2006/main" noChangeAspect="1"/>
+                </wp:cNvGraphicFramePr>
+                <a:graphic xmlns:a="http://schemas.openxmlformats.org/drawingml/2006/main">
+                  <a:graphicData uri="http://schemas.openxmlformats.org/drawingml/2006/picture">
+                    <pic:pic xmlns:pic="http://schemas.openxmlformats.org/drawingml/2006/picture">
+                      <pic:nvPicPr>
+                        <pic:cNvPr id="1587521585" name="Picture 1587521585" descr="C:\Users\rglamigo\AppData\Local\Microsoft\Windows\INetCache\Content.Word\Final DSWD logo_figurative_colored.png"/>
+                        <pic:cNvPicPr>
+                          <a:picLocks noChangeAspect="1" noChangeArrowheads="1"/>
+                        </pic:cNvPicPr>
+                      </pic:nvPicPr>
+                      <pic:blipFill>
+                        <a:blip r:embed="rId1" cstate="print">
+                          <a:extLst>
+                            <a:ext uri="{28A0092B-C50C-407E-A947-70E740481C1C}">
+                              <a14:useLocalDpi xmlns:a14="http://schemas.microsoft.com/office/drawing/2010/main" val="0"/>
+                            </a:ext>
+                          </a:extLst>
+                        </a:blip>
+                        <a:srcRect/>
+                        <a:stretch>
+                          <a:fillRect/>
+                        </a:stretch>
+                      </pic:blipFill>
+                      <pic:spPr>
+                        <a:xfrm>
+                          <a:off x="0" y="0"/>
+                          <a:ext cx="1760220" cy="693420"/>
+                        </a:xfrm>
+                        <a:prstGeom prst="rect">
+                          <a:avLst/>
+                        </a:prstGeom>
+                        <a:noFill/>
+                        <a:ln>
+                          <a:noFill/>
+                        </a:ln>
+                      </pic:spPr>
+                    </pic:pic>
+                  </a:graphicData>
+                </a:graphic>
+              </wp:anchor>
+            </w:drawing>
+          </w:r>
+        </w:p>
+        <w:p>
+          <w:pPr>
+            <w:spacing w:after="0" w:line="240" w:lineRule="auto"/>
+            <w:ind w:right="-330" w:hanging="2"/>
+            <w:rPr>
+              <w:rFonts w:ascii="Times New Roman" w:eastAsia="Times New Roman" w:hAnsi="Times New Roman" w:cs="Times New Roman"/>
+              <w:i/>
+              <w:sz w:val="16"/>
+              <w:szCs w:val="16"/>
+            </w:rPr>
+          </w:pPr>
+        </w:p>
+        <w:p>
+          <w:pPr>
+            <w:spacing w:after="0" w:line="240" w:lineRule="auto"/>
+            <w:ind w:right="-330" w:hanging="2"/>
+            <w:rPr>
+              <w:rFonts w:ascii="Times New Roman" w:eastAsia="Times New Roman" w:hAnsi="Times New Roman" w:cs="Times New Roman"/>
+              <w:i/>
+              <w:sz w:val="16"/>
+              <w:szCs w:val="16"/>
+            </w:rPr>
+          </w:pPr>
+          <w:r>
+            <w:rPr>
+              <w:noProof/>
+              <w:lang w:val="en-US" w:eastAsia="en-US"/>
+            </w:rPr>
+            <mc:AlternateContent>
+              <mc:Choice Requires="wpg">
+                <w:drawing>
+                  <wp:anchor distT="0" distB="0" distL="114300" distR="114300" simplePos="0" relativeHeight="251664384" behindDoc="0" locked="0" layoutInCell="1" allowOverlap="1" wp14:anchorId="1634E3F8" wp14:editId="061A6C07">
+                    <wp:simplePos x="0" y="0"/>
+                    <wp:positionH relativeFrom="column">
+                      <wp:posOffset>-34925</wp:posOffset>
+                    </wp:positionH>
+                    <wp:positionV relativeFrom="paragraph">
+                      <wp:posOffset>103505</wp:posOffset>
+                    </wp:positionV>
+                    <wp:extent cx="1647825" cy="241935"/>
+                    <wp:effectExtent l="0" t="0" r="0" b="5715"/>
+                    <wp:wrapNone/>
+                    <wp:docPr id="10" name="Group 10"/>
+                    <wp:cNvGraphicFramePr/>
+                    <a:graphic xmlns:a="http://schemas.openxmlformats.org/drawingml/2006/main">
+                      <a:graphicData uri="http://schemas.microsoft.com/office/word/2010/wordprocessingGroup">
+                        <wpg:wgp>
+                          <wpg:cNvGrpSpPr/>
+                          <wpg:grpSpPr>
+                            <a:xfrm>
+                              <a:off x="0" y="0"/>
+                              <a:ext cx="1647825" cy="241935"/>
+                              <a:chOff x="4496733" y="3668562"/>
+                              <a:chExt cx="1648730" cy="242459"/>
+                            </a:xfrm>
+                          </wpg:grpSpPr>
+                          <wpg:grpSp>
+                            <wpg:cNvPr id="11" name="Group 11"/>
+                            <wpg:cNvGrpSpPr/>
+                            <wpg:grpSpPr>
+                              <a:xfrm>
+                                <a:off x="4496733" y="3668562"/>
+                                <a:ext cx="1648730" cy="242459"/>
+                                <a:chOff x="4496724" y="3668550"/>
+                                <a:chExt cx="1648751" cy="242475"/>
+                              </a:xfrm>
+                            </wpg:grpSpPr>
+                            <wps:wsp>
+                              <wps:cNvPr id="12" name="Rectangle 12"/>
+                              <wps:cNvSpPr/>
+                              <wps:spPr>
+                                <a:xfrm>
+                                  <a:off x="4546525" y="3668550"/>
+                                  <a:ext cx="1598950" cy="222900"/>
+                                </a:xfrm>
+                                <a:prstGeom prst="rect">
+                                  <a:avLst/>
+                                </a:prstGeom>
+                                <a:noFill/>
+                                <a:ln>
+                                  <a:noFill/>
+                                </a:ln>
+                              </wps:spPr>
+                              <wps:txbx>
+                                <w:txbxContent>
+                                  <w:p>
+                                    <w:pPr>
+                                      <w:spacing w:after="0" w:line="240" w:lineRule="auto"/>
+                                      <w:ind w:firstLine="0"/>
+                                    </w:pPr>
+                                  </w:p>
+                                </w:txbxContent>
+                              </wps:txbx>
+                              <wps:bodyPr spcFirstLastPara="1" wrap="square" lIns="91425" tIns="91425" rIns="91425" bIns="91425" anchor="ctr" anchorCtr="0">
+                                <a:noAutofit/>
+                              </wps:bodyPr>
+                            </wps:wsp>
+                            <wpg:grpSp>
+                              <wpg:cNvPr id="13" name="Group 13"/>
+                              <wpg:cNvGrpSpPr/>
+                              <wpg:grpSpPr>
+                                <a:xfrm>
+                                  <a:off x="4496724" y="3668551"/>
+                                  <a:ext cx="1648740" cy="242474"/>
+                                  <a:chOff x="4496388" y="3663804"/>
+                                  <a:chExt cx="1649393" cy="243150"/>
+                                </a:xfrm>
+                              </wpg:grpSpPr>
+                              <wps:wsp>
+                                <wps:cNvPr id="14" name="Rectangle 14"/>
+                                <wps:cNvSpPr/>
+                                <wps:spPr>
+                                  <a:xfrm>
+                                    <a:off x="4546218" y="3663804"/>
+                                    <a:ext cx="1599550" cy="223500"/>
+                                  </a:xfrm>
+                                  <a:prstGeom prst="rect">
+                                    <a:avLst/>
+                                  </a:prstGeom>
+                                  <a:noFill/>
+                                  <a:ln>
+                                    <a:noFill/>
+                                  </a:ln>
+                                </wps:spPr>
+                                <wps:txbx>
+                                  <w:txbxContent>
+                                    <w:p>
+                                      <w:pPr>
+                                        <w:spacing w:after="0" w:line="240" w:lineRule="auto"/>
+                                        <w:ind w:firstLine="0"/>
+                                      </w:pPr>
+                                    </w:p>
+                                  </w:txbxContent>
+                                </wps:txbx>
+                                <wps:bodyPr spcFirstLastPara="1" wrap="square" lIns="91425" tIns="91425" rIns="91425" bIns="91425" anchor="ctr" anchorCtr="0">
+                                  <a:noAutofit/>
+                                </wps:bodyPr>
+                              </wps:wsp>
+                              <wpg:grpSp>
+                                <wpg:cNvPr id="15" name="Group 15"/>
+                                <wpg:cNvGrpSpPr/>
+                                <wpg:grpSpPr>
+                                  <a:xfrm>
+                                    <a:off x="4496388" y="3672685"/>
+                                    <a:ext cx="1649393" cy="234269"/>
+                                    <a:chOff x="-49839" y="0"/>
+                                    <a:chExt cx="1649689" cy="234269"/>
+                                  </a:xfrm>
+                                </wpg:grpSpPr>
+                                <wps:wsp>
+                                  <wps:cNvPr id="16" name="Rectangle 16"/>
+                                  <wps:cNvSpPr/>
+                                  <wps:spPr>
+                                    <a:xfrm>
+                                      <a:off x="0" y="0"/>
+                                      <a:ext cx="1599850" cy="214625"/>
+                                    </a:xfrm>
+                                    <a:prstGeom prst="rect">
+                                      <a:avLst/>
+                                    </a:prstGeom>
+                                    <a:noFill/>
+                                    <a:ln>
+                                      <a:noFill/>
+                                    </a:ln>
+                                  </wps:spPr>
+                                  <wps:txbx>
+                                    <w:txbxContent>
+                                      <w:p>
+                                        <w:pPr>
+                                          <w:spacing w:after="0" w:line="240" w:lineRule="auto"/>
+                                          <w:ind w:firstLine="0"/>
+                                        </w:pPr>
+                                      </w:p>
+                                    </w:txbxContent>
+                                  </wps:txbx>
+                                  <wps:bodyPr spcFirstLastPara="1" wrap="square" lIns="91425" tIns="91425" rIns="91425" bIns="91425" anchor="ctr" anchorCtr="0">
+                                    <a:noAutofit/>
+                                  </wps:bodyPr>
+                                </wps:wsp>
+                                <wps:wsp>
+                                  <wps:cNvPr id="17" name="Rectangle 17"/>
+                                  <wps:cNvSpPr/>
+                                  <wps:spPr>
+                                    <a:xfrm>
+                                      <a:off x="0" y="31261"/>
+                                      <a:ext cx="1400124" cy="125730"/>
+                                    </a:xfrm>
+                                    <a:prstGeom prst="rect">
+                                      <a:avLst/>
+                                    </a:prstGeom>
+                                    <a:solidFill>
+                                      <a:srgbClr val="1A4397"/>
+                                    </a:solidFill>
+                                    <a:ln>
+                                      <a:noFill/>
+                                    </a:ln>
+                                  </wps:spPr>
+                                  <wps:txbx>
+                                    <w:txbxContent>
+                                      <w:p>
+                                        <w:pPr>
+                                          <w:spacing w:after="0" w:line="240" w:lineRule="auto"/>
+                                          <w:ind w:firstLine="0"/>
+                                        </w:pPr>
+                                      </w:p>
+                                    </w:txbxContent>
+                                  </wps:txbx>
+                                  <wps:bodyPr spcFirstLastPara="1" wrap="square" lIns="91425" tIns="91425" rIns="91425" bIns="91425" anchor="ctr" anchorCtr="0">
+                                    <a:noAutofit/>
+                                  </wps:bodyPr>
+                                </wps:wsp>
+                                <wps:wsp>
+                                  <wps:cNvPr id="18" name="Rectangle 18"/>
+                                  <wps:cNvSpPr/>
+                                  <wps:spPr>
+                                    <a:xfrm>
+                                      <a:off x="-49839" y="19639"/>
+                                      <a:ext cx="1509975" cy="214630"/>
+                                    </a:xfrm>
+                                    <a:prstGeom prst="rect">
+                                      <a:avLst/>
+                                    </a:prstGeom>
+                                    <a:noFill/>
+                                    <a:ln>
+                                      <a:noFill/>
+                                    </a:ln>
+                                  </wps:spPr>
+                                  <wps:txbx>
+                                    <w:txbxContent>
+                                      <w:p>
+                                        <w:pPr>
+                                          <w:spacing w:line="275" w:lineRule="auto"/>
+                                          <w:jc w:val="both"/>
+                                        </w:pPr>
+                                        <w:r>
+                                          <w:rPr>
+                                            <w:rFonts w:ascii="Arial" w:eastAsia="Arial" w:hAnsi="Arial" w:cs="Arial"/>
+                                            <w:b/>
+                                            <w:color w:val="FFFFFF"/>
+                                            <w:sz w:val="12"/>
+                                          </w:rPr>
+                                          <w:t xml:space="preserve">Field </w:t>
+                                        </w:r>
+                                        <w:proofErr w:type="gramStart"/>
+                                        <w:r>
+                                          <w:rPr>
+                                            <w:rFonts w:ascii="Arial" w:eastAsia="Arial" w:hAnsi="Arial" w:cs="Arial"/>
+                                            <w:b/>
+                                            <w:color w:val="FFFFFF"/>
+                                            <w:sz w:val="12"/>
+                                          </w:rPr>
+                                          <w:t>Office  –</w:t>
+                                        </w:r>
+                                        <w:proofErr w:type="gramEnd"/>
+                                        <w:r>
+                                          <w:rPr>
+                                            <w:rFonts w:ascii="Arial" w:eastAsia="Arial" w:hAnsi="Arial" w:cs="Arial"/>
+                                            <w:b/>
+                                            <w:color w:val="FFFFFF"/>
+                                            <w:sz w:val="12"/>
+                                          </w:rPr>
+                                          <w:t xml:space="preserve"> </w:t>
+                                        </w:r>
+                                        <w:proofErr w:type="spellStart"/>
+                                        <w:r>
+                                          <w:rPr>
+                                            <w:rFonts w:ascii="Arial" w:eastAsia="Arial" w:hAnsi="Arial" w:cs="Arial"/>
+                                            <w:b/>
+                                            <w:color w:val="FFFFFF"/>
+                                            <w:sz w:val="12"/>
+                                          </w:rPr>
+                                          <w:t>Caraga</w:t>
+                                        </w:r>
+                                        <w:proofErr w:type="spellEnd"/>
+                                        <w:r>
+                                          <w:rPr>
+                                            <w:rFonts w:ascii="Arial" w:eastAsia="Arial" w:hAnsi="Arial" w:cs="Arial"/>
+                                            <w:b/>
+                                            <w:color w:val="FFFFFF"/>
+                                            <w:sz w:val="12"/>
+                                          </w:rPr>
+                                          <w:t xml:space="preserve"> Region</w:t>
+                                        </w:r>
+                                      </w:p>
+                                    </w:txbxContent>
+                                  </wps:txbx>
+                                  <wps:bodyPr spcFirstLastPara="1" wrap="square" lIns="91425" tIns="45700" rIns="91425" bIns="45700" anchor="t" anchorCtr="0">
+                                    <a:noAutofit/>
+                                  </wps:bodyPr>
+                                </wps:wsp>
+                              </wpg:grpSp>
+                            </wpg:grpSp>
+                          </wpg:grpSp>
+                        </wpg:wgp>
+                      </a:graphicData>
+                    </a:graphic>
+                  </wp:anchor>
+                </w:drawing>
+              </mc:Choice>
+              <mc:Fallback>
+                <w:pict>
+                  <v:group w14:anchorId="1634E3F8" id="Group 10" o:spid="_x0000_s1026" style="position:absolute;margin-left:-2.75pt;margin-top:8.15pt;width:129.75pt;height:19.05pt;z-index:251664384" coordorigin="44967,36685" coordsize="16487,2424" o:gfxdata="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">
+                    <v:group id="Group 11" o:spid="_x0000_s1027" style="position:absolute;left:44967;top:36685;width:16487;height:2425" coordorigin="44967,36685" coordsize="16487,2424" o:gfxdata="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">
+                      <v:rect id="Rectangle 12" o:spid="_x0000_s1028" style="position:absolute;left:45465;top:36685;width:15989;height:2229;visibility:visible;mso-wrap-style:square;v-text-anchor:middle" o:gfxdata="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" filled="f" stroked="f">
+                        <v:textbox inset="2.53958mm,2.53958mm,2.53958mm,2.53958mm">
+                          <w:txbxContent>
+                            <w:p>
+                              <w:pPr>
+                                <w:spacing w:after="0" w:line="240" w:lineRule="auto"/>
+                                <w:ind w:firstLine="0"/>
+                              </w:pPr>
+                            </w:p>
+                          </w:txbxContent>
+                        </v:textbox>
+                      </v:rect>
+                      <v:group id="Group 13" o:spid="_x0000_s1029" style="position:absolute;left:44967;top:36685;width:16487;height:2425" coordorigin="44963,36638" coordsize="16493,2431" o:gfxdata="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">
+                        <v:rect id="Rectangle 14" o:spid="_x0000_s1030" style="position:absolute;left:45462;top:36638;width:15995;height:2235;visibility:visible;mso-wrap-style:square;v-text-anchor:middle" o:gfxdata="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" filled="f" stroked="f">
+                          <v:textbox inset="2.53958mm,2.53958mm,2.53958mm,2.53958mm">
+                            <w:txbxContent>
+                              <w:p>
+                                <w:pPr>
+                                  <w:spacing w:after="0" w:line="240" w:lineRule="auto"/>
+                                  <w:ind w:firstLine="0"/>
+                                </w:pPr>
+                              </w:p>
+                            </w:txbxContent>
+                          </v:textbox>
+                        </v:rect>
+                        <v:group id="Group 15" o:spid="_x0000_s1031" style="position:absolute;left:44963;top:36726;width:16494;height:2343" coordorigin="-498" coordsize="16496,2342" o:gfxdata="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">
+                          <v:rect id="Rectangle 16" o:spid="_x0000_s1032" style="position:absolute;width:15998;height:2146;visibility:visible;mso-wrap-style:square;v-text-anchor:middle" o:gfxdata="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" filled="f" stroked="f">
+                            <v:textbox inset="2.53958mm,2.53958mm,2.53958mm,2.53958mm">
+                              <w:txbxContent>
+                                <w:p>
+                                  <w:pPr>
+                                    <w:spacing w:after="0" w:line="240" w:lineRule="auto"/>
+                                    <w:ind w:firstLine="0"/>
+                                  </w:pPr>
+                                </w:p>
+                              </w:txbxContent>
+                            </v:textbox>
+                          </v:rect>
+                          <v:rect id="Rectangle 17" o:spid="_x0000_s1033" style="position:absolute;top:312;width:14001;height:1257;visibility:visible;mso-wrap-style:square;v-text-anchor:middle" o:gfxdata="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" fillcolor="#1a4397" stroked="f">
+                            <v:textbox inset="2.53958mm,2.53958mm,2.53958mm,2.53958mm">
+                              <w:txbxContent>
+                                <w:p>
+                                  <w:pPr>
+                                    <w:spacing w:after="0" w:line="240" w:lineRule="auto"/>
+                                    <w:ind w:firstLine="0"/>
+                                  </w:pPr>
+                                </w:p>
+                              </w:txbxContent>
+                            </v:textbox>
+                          </v:rect>
+                          <v:rect id="Rectangle 18" o:spid="_x0000_s1034" style="position:absolute;left:-498;top:196;width:15099;height:2146;visibility:visible;mso-wrap-style:square;v-text-anchor:top" o:gfxdata="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" filled="f" stroked="f">
+                            <v:textbox inset="2.53958mm,1.2694mm,2.53958mm,1.2694mm">
+                              <w:txbxContent>
+                                <w:p>
+                                  <w:pPr>
+                                    <w:spacing w:line="275" w:lineRule="auto"/>
+                                    <w:jc w:val="both"/>
+                                  </w:pPr>
+                                  <w:r>
+                                    <w:rPr>
+                                      <w:rFonts w:ascii="Arial" w:eastAsia="Arial" w:hAnsi="Arial" w:cs="Arial"/>
+                                      <w:b/>
+                                      <w:color w:val="FFFFFF"/>
+                                      <w:sz w:val="12"/>
+                                    </w:rPr>
+                                    <w:t xml:space="preserve">Field </w:t>
+                                  </w:r>
+                                  <w:proofErr w:type="gramStart"/>
+                                  <w:r>
+                                    <w:rPr>
+                                      <w:rFonts w:ascii="Arial" w:eastAsia="Arial" w:hAnsi="Arial" w:cs="Arial"/>
+                                      <w:b/>
+                                      <w:color w:val="FFFFFF"/>
+                                      <w:sz w:val="12"/>
+                                    </w:rPr>
+                                    <w:t>Office  –</w:t>
+                                  </w:r>
+                                  <w:proofErr w:type="gramEnd"/>
+                                  <w:r>
+                                    <w:rPr>
+                                      <w:rFonts w:ascii="Arial" w:eastAsia="Arial" w:hAnsi="Arial" w:cs="Arial"/>
+                                      <w:b/>
+                                      <w:color w:val="FFFFFF"/>
+                                      <w:sz w:val="12"/>
+                                    </w:rPr>
+                                    <w:t xml:space="preserve"> </w:t>
+                                  </w:r>
+                                  <w:proofErr w:type="spellStart"/>
+                                  <w:r>
+                                    <w:rPr>
+                                      <w:rFonts w:ascii="Arial" w:eastAsia="Arial" w:hAnsi="Arial" w:cs="Arial"/>
+                                      <w:b/>
+                                      <w:color w:val="FFFFFF"/>
+                                      <w:sz w:val="12"/>
+                                    </w:rPr>
+                                    <w:t>Caraga</w:t>
+                                  </w:r>
+                                  <w:proofErr w:type="spellEnd"/>
+                                  <w:r>
+                                    <w:rPr>
+                                      <w:rFonts w:ascii="Arial" w:eastAsia="Arial" w:hAnsi="Arial" w:cs="Arial"/>
+                                      <w:b/>
+                                      <w:color w:val="FFFFFF"/>
+                                      <w:sz w:val="12"/>
+                                    </w:rPr>
+                                    <w:t xml:space="preserve"> Region</w:t>
+                                  </w:r>
+                                </w:p>
+                              </w:txbxContent>
+                            </v:textbox>
+                          </v:rect>
+                        </v:group>
+                      </v:group>
+                    </v:group>
+                  </v:group>
+                </w:pict>
+              </mc:Fallback>
+            </mc:AlternateContent>
+          </w:r>
+        </w:p>
+        <w:p>
+          <w:pPr>
+            <w:spacing w:after="0" w:line="240" w:lineRule="auto"/>
+            <w:ind w:right="-330" w:firstLine="0"/>
+            <w:rPr>
+              <w:rFonts w:ascii="Times New Roman" w:eastAsia="Times New Roman" w:hAnsi="Times New Roman" w:cs="Times New Roman"/>
+            </w:rPr>
+          </w:pPr>
+        </w:p>
+      </w:tc>
+      <w:tc>
+        <w:tcPr>
+          <w:tcW w:w="3690" w:type="dxa"/>
+        </w:tcPr>
+        <w:p>
+          <w:pPr>
+            <w:spacing w:after="0" w:line="240" w:lineRule="auto"/>
+            <w:ind w:hanging="2"/>
+            <w:jc w:val="right"/>
+            <w:rPr>
+              <w:rFonts w:ascii="Times New Roman" w:eastAsia="Times New Roman" w:hAnsi="Times New Roman" w:cs="Times New Roman"/>
+              <w:color w:val="000000"/>
+            </w:rPr>
+          </w:pPr>
+        </w:p>
+      </w:tc>
+      <w:tc>
+        <w:tcPr>
+          <w:tcW w:w="2745" w:type="dxa"/>
+        </w:tcPr>
+        <w:p>
+          <w:pPr>
+            <w:spacing w:after="0" w:line="240" w:lineRule="auto"/>
+            <w:ind w:hanging="2"/>
+            <w:jc w:val="right"/>
+            <w:rPr>
+              <w:rFonts w:ascii="Times New Roman" w:eastAsia="Times New Roman" w:hAnsi="Times New Roman" w:cs="Times New Roman"/>
+              <w:color w:val="000000"/>
+            </w:rPr>
+          </w:pPr>
+        </w:p>
+      </w:tc>
+      <w:tc>
+        <w:tcPr>
+          <w:tcW w:w="2745" w:type="dxa"/>
+        </w:tcPr>
+        <w:p>
+          <w:pPr>
+            <w:spacing w:after="0" w:line="240" w:lineRule="auto"/>
+            <w:ind w:hanging="2"/>
+            <w:jc w:val="right"/>
+            <w:rPr>
+              <w:rFonts w:ascii="Times New Roman" w:eastAsia="Times New Roman" w:hAnsi="Times New Roman" w:cs="Times New Roman"/>
+              <w:color w:val="000000"/>
+            </w:rPr>
+          </w:pPr>
+        </w:p>
+      </w:tc>
+    </w:tr>
+    <w:tr>
+      <w:trPr>
+        <w:trHeight w:val="573"/>
+      </w:trPr>
+      <w:tc>
+        <w:tcPr>
+          <w:tcW w:w="2716" w:type="dxa"/>
+          <w:vMerge/>
+          <w:vAlign w:val="center"/>
+        </w:tcPr>
+        <w:p>
+          <w:pPr>
+            <w:widowControl w:val="0"/>
+            <w:spacing w:after="0"/>
+            <w:ind w:firstLine="0"/>
+            <w:rPr>
+              <w:rFonts w:ascii="Times New Roman" w:eastAsia="Times New Roman" w:hAnsi="Times New Roman" w:cs="Times New Roman"/>
+              <w:color w:val="000000"/>
+            </w:rPr>
+          </w:pPr>
+        </w:p>
+      </w:tc>
+      <w:tc>
+        <w:tcPr>
+          <w:tcW w:w="3690" w:type="dxa"/>
+        </w:tcPr>
+        <w:p>
+          <w:pPr>
+            <w:spacing w:after="0" w:line="240" w:lineRule="auto"/>
+            <w:ind w:right="36" w:hanging="2"/>
+            <w:rPr>
+              <w:rFonts w:ascii="Times New Roman" w:eastAsia="Times New Roman" w:hAnsi="Times New Roman" w:cs="Times New Roman"/>
+              <w:sz w:val="8"/>
+              <w:szCs w:val="8"/>
+            </w:rPr>
+          </w:pPr>
+          <w:r>
+            <w:rPr>
+              <w:rFonts w:ascii="Times New Roman" w:eastAsia="Times New Roman" w:hAnsi="Times New Roman" w:cs="Times New Roman"/>
+              <w:i/>
+              <w:noProof/>
+              <w:sz w:val="16"/>
+              <w:szCs w:val="16"/>
+              <w:lang w:val="en-US" w:eastAsia="en-US"/>
+            </w:rPr>
+            <w:drawing>
+              <wp:anchor distT="0" distB="0" distL="0" distR="0" simplePos="0" relativeHeight="251663360" behindDoc="0" locked="0" layoutInCell="1" allowOverlap="1" wp14:anchorId="3EAEEE3B" wp14:editId="57F63548">
+                <wp:simplePos x="0" y="0"/>
+                <wp:positionH relativeFrom="page">
+                  <wp:posOffset>-195580</wp:posOffset>
+                </wp:positionH>
+                <wp:positionV relativeFrom="page">
+                  <wp:posOffset>-146050</wp:posOffset>
+                </wp:positionV>
+                <wp:extent cx="603250" cy="532765"/>
+                <wp:effectExtent l="0" t="0" r="6350" b="635"/>
+                <wp:wrapNone/>
+                <wp:docPr id="20" name="image2.png"/>
+                <wp:cNvGraphicFramePr/>
+                <a:graphic xmlns:a="http://schemas.openxmlformats.org/drawingml/2006/main">
+                  <a:graphicData uri="http://schemas.openxmlformats.org/drawingml/2006/picture">
+                    <pic:pic xmlns:pic="http://schemas.openxmlformats.org/drawingml/2006/picture">
+                      <pic:nvPicPr>
+                        <pic:cNvPr id="1759300004" name="image2.png"/>
+                        <pic:cNvPicPr preferRelativeResize="0"/>
+                      </pic:nvPicPr>
+                      <pic:blipFill>
+                        <a:blip r:embed="rId2"/>
+                        <a:srcRect l="68745" t="5246" r="7196" b="16566"/>
+                        <a:stretch>
+                          <a:fillRect/>
+                        </a:stretch>
+                      </pic:blipFill>
+                      <pic:spPr>
+                        <a:xfrm>
+                          <a:off x="0" y="0"/>
+                          <a:ext cx="604351" cy="533905"/>
+                        </a:xfrm>
+                        <a:prstGeom prst="rect">
+                          <a:avLst/>
+                        </a:prstGeom>
+                      </pic:spPr>
+                    </pic:pic>
+                  </a:graphicData>
+                </a:graphic>
+              </wp:anchor>
+            </w:drawing>
+          </w:r>
+        </w:p>
+      </w:tc>
+      <w:tc>
+        <w:tcPr>
+          <w:tcW w:w="2745" w:type="dxa"/>
+        </w:tcPr>
+        <w:p>
+          <w:pPr>
+            <w:tabs>
+              <w:tab w:val="left" w:pos="3299"/>
+              <w:tab w:val="right" w:pos="4292"/>
+            </w:tabs>
+            <w:spacing w:after="0" w:line="240" w:lineRule="auto"/>
+            <w:ind w:hanging="2"/>
+            <w:jc w:val="right"/>
+            <w:rPr>
+              <w:rFonts w:ascii="Times New Roman" w:eastAsia="Times New Roman" w:hAnsi="Times New Roman" w:cs="Times New Roman"/>
+              <w:i/>
+              <w:sz w:val="16"/>
+              <w:szCs w:val="16"/>
+            </w:rPr>
+          </w:pPr>
+        </w:p>
+      </w:tc>
+      <w:tc>
+        <w:tcPr>
+          <w:tcW w:w="2745" w:type="dxa"/>
+        </w:tcPr>
+        <w:p>
+          <w:pPr>
+            <w:tabs>
+              <w:tab w:val="left" w:pos="3299"/>
+              <w:tab w:val="right" w:pos="4292"/>
+            </w:tabs>
+            <w:spacing w:after="0" w:line="240" w:lineRule="auto"/>
+            <w:ind w:hanging="2"/>
+            <w:jc w:val="right"/>
+            <w:rPr>
+              <w:rFonts w:ascii="Times New Roman" w:eastAsia="Times New Roman" w:hAnsi="Times New Roman" w:cs="Times New Roman"/>
+              <w:i/>
+              <w:sz w:val="16"/>
+              <w:szCs w:val="16"/>
+            </w:rPr>
+          </w:pPr>
+        </w:p>
+      </w:tc>
+    </w:tr>
+  </w:tbl>
+  <w:p>
+    <w:pPr>
+      <w:spacing w:after="0" w:line="240" w:lineRule="auto"/>
+      <w:ind w:firstLine="0"/>
+      <w:rPr>
+        <w:rFonts w:ascii="Times New Roman" w:eastAsia="Times New Roman" w:hAnsi="Times New Roman" w:cs="Times New Roman"/>
+        <w:i/>
+        <w:sz w:val="16"/>
+        <w:szCs w:val="16"/>
+      </w:rPr>
+    </w:pPr>
+  </w:p>
+</w:hdr>
+</file>
+
+<file path=word/header3.xml><?xml version="1.0" encoding="utf-8"?>
+<w:hdr xmlns:wpc="http://schemas.microsoft.com/office/word/2010/wordprocessingCanvas" xmlns:mc="http://schemas.openxmlformats.org/markup-compatibility/2006" xmlns:o="urn:schemas-microsoft-com:office:office" xmlns:r="http://schemas.openxmlformats.org/officeDocument/2006/relationships" xmlns:m="http://schemas.openxmlformats.org/officeDocument/2006/math" xmlns:v="urn:schemas-microsoft-com:vml" xmlns:wp14="http://schemas.microsoft.com/office/word/2010/wordprocessingDrawing" xmlns:wp="http://schemas.openxmlformats.org/drawingml/2006/wordprocessingDrawing" xmlns:w10="urn:schemas-microsoft-com:office:word" xmlns:w="http://schemas.openxmlformats.org/wordprocessingml/2006/main" xmlns:w14="http://schemas.microsoft.com/office/word/2010/wordml" xmlns:w15="http://schemas.microsoft.com/office/word/2012/wordml" xmlns:wpg="http://schemas.microsoft.com/office/word/2010/wordprocessingGroup" xmlns:wpi="http://schemas.microsoft.com/office/word/2010/wordprocessingInk" xmlns:wne="http://schemas.microsoft.com/office/word/2006/wordml" xmlns:wps="http://schemas.microsoft.com/office/word/2010/wordprocessingShape" mc:Ignorable="w14 w15 wp14">
+  <w:p>
+    <w:pPr>
+      <w:widowControl w:val="0"/>
+      <w:spacing w:after="0"/>
+      <w:ind w:hanging="2"/>
+      <w:jc w:val="right"/>
+      <w:rPr>
+        <w:rFonts w:ascii="Times New Roman" w:eastAsia="Times New Roman" w:hAnsi="Times New Roman" w:cs="Times New Roman"/>
+        <w:sz w:val="24"/>
+        <w:szCs w:val="24"/>
+      </w:rPr>
+    </w:pPr>
+    <w:bookmarkStart w:id="2" w:name="_Hlk191635190"/>
+  </w:p>
+  <w:tbl>
+    <w:tblPr>
+      <w:tblStyle w:val="Style17"/>
+      <w:tblW w:w="11896" w:type="dxa"/>
+      <w:tblInd w:w="-108" w:type="dxa"/>
+      <w:tblLayout w:type="fixed"/>
+      <w:tblLook w:val="04A0" w:firstRow="1" w:lastRow="0" w:firstColumn="1" w:lastColumn="0" w:noHBand="0" w:noVBand="1"/>
+    </w:tblPr>
+    <w:tblGrid>
+      <w:gridCol w:w="2716"/>
+      <w:gridCol w:w="3690"/>
+      <w:gridCol w:w="2745"/>
+      <w:gridCol w:w="2745"/>
+    </w:tblGrid>
+    <w:tr>
+      <w:trPr>
+        <w:trHeight w:val="177"/>
+      </w:trPr>
+      <w:tc>
+        <w:tcPr>
+          <w:tcW w:w="2716" w:type="dxa"/>
+          <w:vMerge w:val="restart"/>
+          <w:vAlign w:val="center"/>
+        </w:tcPr>
+        <w:p>
+          <w:pPr>
+            <w:spacing w:after="0" w:line="240" w:lineRule="auto"/>
+            <w:ind w:hanging="2"/>
+            <w:rPr>
+              <w:rFonts w:ascii="Times New Roman" w:eastAsia="Times New Roman" w:hAnsi="Times New Roman" w:cs="Times New Roman"/>
+              <w:color w:val="000000"/>
+            </w:rPr>
+          </w:pPr>
+          <w:bookmarkStart w:id="3" w:name="_heading=h.1fob9te" w:colFirst="0" w:colLast="0"/>
           <w:bookmarkEnd w:id="2"/>
+          <w:bookmarkEnd w:id="3"/>
           <w:r>
             <w:rPr>
               <w:rFonts w:ascii="Arial" w:eastAsia="Arial" w:hAnsi="Arial" w:cs="Arial"/>
@@ -1796,7 +3054,7 @@
                   </wp:anchor>
                 </w:drawing>
               </mc:Choice>
-              <mc:Fallback>
+              <mc:Fallback xmlns:w16se="http://schemas.microsoft.com/office/word/2015/wordml/symex" xmlns:w16sdtfl="http://schemas.microsoft.com/office/word/2024/wordml/sdtformatlock" xmlns:w16sdtdh="http://schemas.microsoft.com/office/word/2020/wordml/sdtdatahash" xmlns:w16du="http://schemas.microsoft.com/office/word/2023/wordml/word16du" xmlns:w16="http://schemas.microsoft.com/office/word/2018/wordml" xmlns:w16cid="http://schemas.microsoft.com/office/word/2016/wordml/cid" xmlns:w16cex="http://schemas.microsoft.com/office/word/2018/wordml/cex" xmlns:oel="http://schemas.microsoft.com/office/2019/extlst" xmlns:am3d="http://schemas.microsoft.com/office/drawing/2017/model3d" xmlns:aink="http://schemas.microsoft.com/office/drawing/2016/ink" xmlns:cx8="http://schemas.microsoft.com/office/drawing/2016/5/14/chartex" xmlns:cx7="http://schemas.microsoft.com/office/drawing/2016/5/13/chartex" xmlns:cx6="http://schemas.microsoft.com/office/drawing/2016/5/12/chartex" xmlns:cx5="http://schemas.microsoft.com/office/drawing/2016/5/11/chartex" xmlns:cx4="http://schemas.microsoft.com/office/drawing/2016/5/10/chartex" xmlns:cx3="http://schemas.microsoft.com/office/drawing/2016/5/9/chartex" xmlns:cx2="http://schemas.microsoft.com/office/drawing/2015/10/21/chartex" xmlns:cx1="http://schemas.microsoft.com/office/drawing/2015/9/8/chartex" xmlns:cx="http://schemas.microsoft.com/office/drawing/2014/chartex">
                 <w:pict>
                   <v:group id="Group 223" o:spid="_x0000_s1026" style="position:absolute;margin-left:-2.75pt;margin-top:8.15pt;width:129.75pt;height:19.05pt;z-index:251660288" coordorigin="44967,36685" coordsize="16487,2424" o:gfxdata="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">
                     <v:group id="Group 1" o:spid="_x0000_s1027" style="position:absolute;left:44967;top:36685;width:16487;height:2425" coordorigin="44967,36685" coordsize="16487,2424" o:gfxdata="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">
@@ -2108,7 +3366,7 @@
 </file>
 
 <file path=word/styles.xml><?xml version="1.0" encoding="utf-8"?>
-<w:styles xmlns:mc="http://schemas.openxmlformats.org/markup-compatibility/2006" xmlns:r="http://schemas.openxmlformats.org/officeDocument/2006/relationships" xmlns:w="http://schemas.openxmlformats.org/wordprocessingml/2006/main" xmlns:w14="http://schemas.microsoft.com/office/word/2010/wordml" xmlns:w15="http://schemas.microsoft.com/office/word/2012/wordml" xmlns:w16cex="http://schemas.microsoft.com/office/word/2018/wordml/cex" xmlns:w16cid="http://schemas.microsoft.com/office/word/2016/wordml/cid" xmlns:w16="http://schemas.microsoft.com/office/word/2018/wordml" xmlns:w16du="http://schemas.microsoft.com/office/word/2023/wordml/word16du" xmlns:w16sdtdh="http://schemas.microsoft.com/office/word/2020/wordml/sdtdatahash" xmlns:w16sdtfl="http://schemas.microsoft.com/office/word/2024/wordml/sdtformatlock" xmlns:w16se="http://schemas.microsoft.com/office/word/2015/wordml/symex" mc:Ignorable="w14 w15 w16se w16cid w16 w16cex w16sdtdh w16sdtfl w16du">
+<w:styles xmlns:mc="http://schemas.openxmlformats.org/markup-compatibility/2006" xmlns:r="http://schemas.openxmlformats.org/officeDocument/2006/relationships" xmlns:w="http://schemas.openxmlformats.org/wordprocessingml/2006/main" xmlns:w14="http://schemas.microsoft.com/office/word/2010/wordml" xmlns:w15="http://schemas.microsoft.com/office/word/2012/wordml" mc:Ignorable="w14 w15">
   <w:docDefaults>
     <w:rPrDefault>
       <w:rPr>
@@ -2118,7 +3376,7 @@
     </w:rPrDefault>
     <w:pPrDefault/>
   </w:docDefaults>
-  <w:latentStyles w:defLockedState="0" w:defUIPriority="99" w:defSemiHidden="0" w:defUnhideWhenUsed="0" w:defQFormat="0" w:count="376">
+  <w:latentStyles w:defLockedState="0" w:defUIPriority="99" w:defSemiHidden="0" w:defUnhideWhenUsed="0" w:defQFormat="0" w:count="371">
     <w:lsdException w:name="Normal" w:uiPriority="0" w:qFormat="1"/>
     <w:lsdException w:name="heading 1" w:uiPriority="0" w:qFormat="1"/>
     <w:lsdException w:name="heading 2" w:uiPriority="0" w:qFormat="1"/>
@@ -2490,11 +3748,6 @@
     <w:lsdException w:name="List Table 5 Dark Accent 6" w:uiPriority="50"/>
     <w:lsdException w:name="List Table 6 Colorful Accent 6" w:uiPriority="51"/>
     <w:lsdException w:name="List Table 7 Colorful Accent 6" w:uiPriority="52"/>
-    <w:lsdException w:name="Mention" w:semiHidden="1" w:unhideWhenUsed="1"/>
-    <w:lsdException w:name="Smart Hyperlink" w:semiHidden="1" w:unhideWhenUsed="1"/>
-    <w:lsdException w:name="Hashtag" w:semiHidden="1" w:unhideWhenUsed="1"/>
-    <w:lsdException w:name="Unresolved Mention" w:semiHidden="1" w:unhideWhenUsed="1"/>
-    <w:lsdException w:name="Smart Link" w:semiHidden="1" w:unhideWhenUsed="1"/>
   </w:latentStyles>
   <w:style w:type="paragraph" w:default="1" w:styleId="Normal">
     <w:name w:val="Normal"/>
@@ -3058,7 +4311,12 @@
 </file>
 
 <file path=customXml/item1.xml><?xml version="1.0" encoding="utf-8"?>
-<b:Sources xmlns:b="http://schemas.openxmlformats.org/officeDocument/2006/bibliography" xmlns="http://schemas.openxmlformats.org/officeDocument/2006/bibliography" SelectedStyle="\APASixthEditionOfficeOnline.xsl" StyleName="APA" Version="6"/>
+<s:customData xmlns="http://www.wps.cn/officeDocument/2013/wpsCustomData" xmlns:s="http://www.wps.cn/officeDocument/2013/wpsCustomData">
+  <customSectProps/>
+  <customShpExts>
+    <customShpInfo spid="_x0000_s1026" textRotate="1"/>
+  </customShpExts>
+</s:customData>
 </file>
 
 <file path=customXml/item2.xml><?xml version="1.0" encoding="utf-8"?>
@@ -3068,18 +4326,13 @@
 </file>
 
 <file path=customXml/item3.xml><?xml version="1.0" encoding="utf-8"?>
-<s:customData xmlns="http://www.wps.cn/officeDocument/2013/wpsCustomData" xmlns:s="http://www.wps.cn/officeDocument/2013/wpsCustomData">
-  <customSectProps/>
-  <customShpExts>
-    <customShpInfo spid="_x0000_s1026" textRotate="1"/>
-  </customShpExts>
-</s:customData>
+<b:Sources xmlns:b="http://schemas.openxmlformats.org/officeDocument/2006/bibliography" xmlns="http://schemas.openxmlformats.org/officeDocument/2006/bibliography" SelectedStyle="\APASixthEditionOfficeOnline.xsl" StyleName="APA" Version="6"/>
 </file>
 
 <file path=customXml/itemProps1.xml><?xml version="1.0" encoding="utf-8"?>
-<ds:datastoreItem xmlns:ds="http://schemas.openxmlformats.org/officeDocument/2006/customXml" ds:itemID="{DF6BF8CB-266D-4B0F-A239-3E5E16970E66}">
+<ds:datastoreItem xmlns:ds="http://schemas.openxmlformats.org/officeDocument/2006/customXml" ds:itemID="{B1977F7D-205B-4081-913C-38D41E755F92}">
   <ds:schemaRefs>
-    <ds:schemaRef ds:uri="http://schemas.openxmlformats.org/officeDocument/2006/bibliography"/>
+    <ds:schemaRef ds:uri="http://www.wps.cn/officeDocument/2013/wpsCustomData"/>
   </ds:schemaRefs>
 </ds:datastoreItem>
 </file>
@@ -3094,9 +4347,9 @@
 </file>
 
 <file path=customXml/itemProps3.xml><?xml version="1.0" encoding="utf-8"?>
-<ds:datastoreItem xmlns:ds="http://schemas.openxmlformats.org/officeDocument/2006/customXml" ds:itemID="{B1977F7D-205B-4081-913C-38D41E755F92}">
+<ds:datastoreItem xmlns:ds="http://schemas.openxmlformats.org/officeDocument/2006/customXml" ds:itemID="{B1201449-F922-40D6-8849-A9DD78BDF46C}">
   <ds:schemaRefs>
-    <ds:schemaRef ds:uri="http://www.wps.cn/officeDocument/2013/wpsCustomData"/>
+    <ds:schemaRef ds:uri="http://schemas.openxmlformats.org/officeDocument/2006/bibliography"/>
   </ds:schemaRefs>
 </ds:datastoreItem>
 </file>
</xml_diff>